<commit_message>
Report last updates :)
</commit_message>
<xml_diff>
--- a/ipai_project/doc/IPAI2025_report_group_03.docx
+++ b/ipai_project/doc/IPAI2025_report_group_03.docx
@@ -239,13 +239,8 @@
           </w:tcPr>
           <w:p>
             <w:r>
-              <w:t xml:space="preserve">Pedro </w:t>
-            </w:r>
-            <w:proofErr w:type="spellStart"/>
-            <w:r>
-              <w:t>Fanica</w:t>
-            </w:r>
-            <w:proofErr w:type="spellEnd"/>
+              <w:t>Pedro Fanica</w:t>
+            </w:r>
           </w:p>
         </w:tc>
       </w:tr>
@@ -377,31 +372,7 @@
         <w:t>Centralized Data Warehouse:</w:t>
       </w:r>
       <w:r>
-        <w:t xml:space="preserve"> A custom ETL pipeline extracts and harmonizes fragmented data from </w:t>
-      </w:r>
-      <w:proofErr w:type="spellStart"/>
-      <w:r>
-        <w:t>UniProt</w:t>
-      </w:r>
-      <w:proofErr w:type="spellEnd"/>
-      <w:r>
-        <w:t xml:space="preserve">, </w:t>
-      </w:r>
-      <w:proofErr w:type="spellStart"/>
-      <w:r>
-        <w:t>ChEMBL</w:t>
-      </w:r>
-      <w:proofErr w:type="spellEnd"/>
-      <w:r>
-        <w:t xml:space="preserve">, </w:t>
-      </w:r>
-      <w:proofErr w:type="spellStart"/>
-      <w:r>
-        <w:t>PDBe</w:t>
-      </w:r>
-      <w:proofErr w:type="spellEnd"/>
-      <w:r>
-        <w:t>, and PubMed into a cloud-hosted AWS RDS Data Warehouse (Temporal Star Schema).</w:t>
+        <w:t xml:space="preserve"> A custom ETL pipeline extracts and harmonizes fragmented data from UniProt, ChEMBL, PDBe, and PubMed into a cloud-hosted AWS RDS Data Warehouse (Temporal Star Schema).</w:t>
       </w:r>
     </w:p>
     <w:p>
@@ -440,15 +411,7 @@
         <w:t>Interactive Evaluation:</w:t>
       </w:r>
       <w:r>
-        <w:t xml:space="preserve"> A real-time </w:t>
-      </w:r>
-      <w:proofErr w:type="spellStart"/>
-      <w:r>
-        <w:t>Jupyter</w:t>
-      </w:r>
-      <w:proofErr w:type="spellEnd"/>
-      <w:r>
-        <w:t xml:space="preserve"> UI Playground allows researchers to run head-to-head model comparisons, proving the Hybrid engine's ability to maximize both precision and recall.</w:t>
+        <w:t xml:space="preserve"> A real-time Jupyter UI Playground allows researchers to run head-to-head model comparisons, proving the Hybrid engine's ability to maximize both precision and recall.</w:t>
       </w:r>
     </w:p>
     <w:p>
@@ -463,14 +426,7 @@
           <w:b/>
           <w:bCs/>
         </w:rPr>
-        <w:t>Evolution</w:t>
-      </w:r>
-      <w:r>
-        <w:rPr>
-          <w:b/>
-          <w:bCs/>
-        </w:rPr>
-        <w:t>:</w:t>
+        <w:t>Evolution:</w:t>
       </w:r>
       <w:r>
         <w:t xml:space="preserve"> By structuring highly fragmented biomedical data into a centralized schema, the system also establishes a robust foundation that can support future predictive Machine Learning pipelines, such as drug-target affinity modeling.</w:t>
@@ -535,14 +491,7 @@
         <w:t xml:space="preserve">Motivation: </w:t>
       </w:r>
       <w:r>
-        <w:rPr>
-          <w:b/>
-          <w:bCs/>
-        </w:rPr>
-        <w:t>Motivation:</w:t>
-      </w:r>
-      <w:r>
-        <w:t xml:space="preserve"> Biomedical knowledge is notoriously fragmented across isolated databases. By fusing structured biochemical metrics (e.g., IC50, 3D coordinates) with unstructured medical literature, this system bridges the gap between raw data and scientific context. This centralized data architecture powers our core retrieval engine today, while providing a robust foundation for future advanced biomedical modeling.</w:t>
+        <w:t>Biomedical knowledge is notoriously fragmented across isolated databases. By fusing structured biochemical metrics (e.g., IC50, 3D coordinates) with unstructured medical literature, this system bridges the gap between raw data and scientific context. This centralized data architecture powers our core retrieval engine today, while providing a robust foundation for future advanced biomedical modeling.</w:t>
       </w:r>
     </w:p>
     <w:p>
@@ -693,7 +642,6 @@
                 <w14:ligatures w14:val="none"/>
               </w:rPr>
             </w:pPr>
-            <w:proofErr w:type="spellStart"/>
             <w:r>
               <w:rPr>
                 <w:rFonts w:eastAsia="Times New Roman" w:cs="Arial"/>
@@ -705,10 +653,25 @@
                 <w:szCs w:val="20"/>
                 <w14:ligatures w14:val="none"/>
               </w:rPr>
-              <w:t>UniProtKB</w:t>
-            </w:r>
-            <w:proofErr w:type="spellEnd"/>
-            <w:r>
+              <w:t>UniProtKB (Swiss-Prot)</w:t>
+            </w:r>
+          </w:p>
+        </w:tc>
+        <w:tc>
+          <w:tcPr>
+            <w:tcW w:w="2185" w:type="dxa"/>
+            <w:tcBorders>
+              <w:top w:val="single" w:sz="4" w:space="0" w:color="auto"/>
+              <w:left w:val="nil"/>
+              <w:bottom w:val="single" w:sz="4" w:space="0" w:color="auto"/>
+              <w:right w:val="single" w:sz="4" w:space="0" w:color="auto"/>
+            </w:tcBorders>
+            <w:shd w:val="clear" w:color="auto" w:fill="E8E8E8" w:themeFill="background2"/>
+            <w:hideMark/>
+          </w:tcPr>
+          <w:p>
+            <w:pPr>
+              <w:spacing w:after="0" w:line="240" w:lineRule="auto"/>
               <w:rPr>
                 <w:rFonts w:eastAsia="Times New Roman" w:cs="Arial"/>
                 <w:b/>
@@ -719,25 +682,8 @@
                 <w:szCs w:val="20"/>
                 <w14:ligatures w14:val="none"/>
               </w:rPr>
-              <w:t xml:space="preserve"> (Swiss-Prot)</w:t>
-            </w:r>
-          </w:p>
-        </w:tc>
-        <w:tc>
-          <w:tcPr>
-            <w:tcW w:w="2185" w:type="dxa"/>
-            <w:tcBorders>
-              <w:top w:val="single" w:sz="4" w:space="0" w:color="auto"/>
-              <w:left w:val="nil"/>
-              <w:bottom w:val="single" w:sz="4" w:space="0" w:color="auto"/>
-              <w:right w:val="single" w:sz="4" w:space="0" w:color="auto"/>
-            </w:tcBorders>
-            <w:shd w:val="clear" w:color="auto" w:fill="E8E8E8" w:themeFill="background2"/>
-            <w:hideMark/>
-          </w:tcPr>
-          <w:p>
-            <w:pPr>
-              <w:spacing w:after="0" w:line="240" w:lineRule="auto"/>
+            </w:pPr>
+            <w:r>
               <w:rPr>
                 <w:rFonts w:eastAsia="Times New Roman" w:cs="Arial"/>
                 <w:b/>
@@ -748,9 +694,25 @@
                 <w:szCs w:val="20"/>
                 <w14:ligatures w14:val="none"/>
               </w:rPr>
-            </w:pPr>
-            <w:proofErr w:type="spellStart"/>
-            <w:r>
+              <w:t>ChEMBL (v36)</w:t>
+            </w:r>
+          </w:p>
+        </w:tc>
+        <w:tc>
+          <w:tcPr>
+            <w:tcW w:w="0" w:type="auto"/>
+            <w:tcBorders>
+              <w:top w:val="single" w:sz="4" w:space="0" w:color="auto"/>
+              <w:left w:val="nil"/>
+              <w:bottom w:val="single" w:sz="4" w:space="0" w:color="auto"/>
+              <w:right w:val="single" w:sz="4" w:space="0" w:color="auto"/>
+            </w:tcBorders>
+            <w:shd w:val="clear" w:color="auto" w:fill="E8E8E8" w:themeFill="background2"/>
+            <w:hideMark/>
+          </w:tcPr>
+          <w:p>
+            <w:pPr>
+              <w:spacing w:after="0" w:line="240" w:lineRule="auto"/>
               <w:rPr>
                 <w:rFonts w:eastAsia="Times New Roman" w:cs="Arial"/>
                 <w:b/>
@@ -761,9 +723,7 @@
                 <w:szCs w:val="20"/>
                 <w14:ligatures w14:val="none"/>
               </w:rPr>
-              <w:t>ChEMBL</w:t>
-            </w:r>
-            <w:proofErr w:type="spellEnd"/>
+            </w:pPr>
             <w:r>
               <w:rPr>
                 <w:rFonts w:eastAsia="Times New Roman" w:cs="Arial"/>
@@ -775,51 +735,8 @@
                 <w:szCs w:val="20"/>
                 <w14:ligatures w14:val="none"/>
               </w:rPr>
-              <w:t xml:space="preserve"> (v36)</w:t>
-            </w:r>
-          </w:p>
-        </w:tc>
-        <w:tc>
-          <w:tcPr>
-            <w:tcW w:w="0" w:type="auto"/>
-            <w:tcBorders>
-              <w:top w:val="single" w:sz="4" w:space="0" w:color="auto"/>
-              <w:left w:val="nil"/>
-              <w:bottom w:val="single" w:sz="4" w:space="0" w:color="auto"/>
-              <w:right w:val="single" w:sz="4" w:space="0" w:color="auto"/>
-            </w:tcBorders>
-            <w:shd w:val="clear" w:color="auto" w:fill="E8E8E8" w:themeFill="background2"/>
-            <w:hideMark/>
-          </w:tcPr>
-          <w:p>
-            <w:pPr>
-              <w:spacing w:after="0" w:line="240" w:lineRule="auto"/>
-              <w:rPr>
-                <w:rFonts w:eastAsia="Times New Roman" w:cs="Arial"/>
-                <w:b/>
-                <w:bCs/>
-                <w:color w:val="000000"/>
-                <w:kern w:val="0"/>
-                <w:sz w:val="20"/>
-                <w:szCs w:val="20"/>
-                <w14:ligatures w14:val="none"/>
-              </w:rPr>
-            </w:pPr>
-            <w:proofErr w:type="spellStart"/>
-            <w:r>
-              <w:rPr>
-                <w:rFonts w:eastAsia="Times New Roman" w:cs="Arial"/>
-                <w:b/>
-                <w:bCs/>
-                <w:color w:val="000000"/>
-                <w:kern w:val="0"/>
-                <w:sz w:val="20"/>
-                <w:szCs w:val="20"/>
-                <w14:ligatures w14:val="none"/>
-              </w:rPr>
               <w:t>PDBe</w:t>
             </w:r>
-            <w:proofErr w:type="spellEnd"/>
           </w:p>
         </w:tc>
         <w:tc>
@@ -932,7 +849,6 @@
                 <w14:ligatures w14:val="none"/>
               </w:rPr>
             </w:pPr>
-            <w:proofErr w:type="spellStart"/>
             <w:r>
               <w:rPr>
                 <w:rFonts w:eastAsia="Times New Roman" w:cs="Arial"/>
@@ -942,19 +858,7 @@
                 <w:szCs w:val="20"/>
                 <w14:ligatures w14:val="none"/>
               </w:rPr>
-              <w:t>UniProt</w:t>
-            </w:r>
-            <w:proofErr w:type="spellEnd"/>
-            <w:r>
-              <w:rPr>
-                <w:rFonts w:eastAsia="Times New Roman" w:cs="Arial"/>
-                <w:color w:val="000000"/>
-                <w:kern w:val="0"/>
-                <w:sz w:val="20"/>
-                <w:szCs w:val="20"/>
-                <w14:ligatures w14:val="none"/>
-              </w:rPr>
-              <w:t xml:space="preserve"> REST API </w:t>
+              <w:t xml:space="preserve">UniProt REST API </w:t>
             </w:r>
             <w:r>
               <w:rPr>
@@ -1072,7 +976,6 @@
                 <w14:ligatures w14:val="none"/>
               </w:rPr>
             </w:pPr>
-            <w:proofErr w:type="spellStart"/>
             <w:r>
               <w:rPr>
                 <w:rFonts w:eastAsia="Times New Roman" w:cs="Arial"/>
@@ -1082,19 +985,7 @@
                 <w:szCs w:val="20"/>
                 <w14:ligatures w14:val="none"/>
               </w:rPr>
-              <w:t>PDBe</w:t>
-            </w:r>
-            <w:proofErr w:type="spellEnd"/>
-            <w:r>
-              <w:rPr>
-                <w:rFonts w:eastAsia="Times New Roman" w:cs="Arial"/>
-                <w:color w:val="000000"/>
-                <w:kern w:val="0"/>
-                <w:sz w:val="20"/>
-                <w:szCs w:val="20"/>
-                <w14:ligatures w14:val="none"/>
-              </w:rPr>
-              <w:t xml:space="preserve"> Graph API </w:t>
+              <w:t xml:space="preserve">PDBe Graph API </w:t>
             </w:r>
             <w:r>
               <w:rPr>
@@ -1105,9 +996,44 @@
                 <w:szCs w:val="16"/>
                 <w14:ligatures w14:val="none"/>
               </w:rPr>
-              <w:t>(/</w:t>
-            </w:r>
-            <w:proofErr w:type="spellStart"/>
+              <w:t>(/best_structures/)</w:t>
+            </w:r>
+          </w:p>
+        </w:tc>
+        <w:tc>
+          <w:tcPr>
+            <w:tcW w:w="0" w:type="auto"/>
+            <w:tcBorders>
+              <w:top w:val="nil"/>
+              <w:left w:val="nil"/>
+              <w:bottom w:val="single" w:sz="4" w:space="0" w:color="auto"/>
+              <w:right w:val="single" w:sz="4" w:space="0" w:color="auto"/>
+            </w:tcBorders>
+            <w:hideMark/>
+          </w:tcPr>
+          <w:p>
+            <w:pPr>
+              <w:spacing w:after="0" w:line="240" w:lineRule="auto"/>
+              <w:rPr>
+                <w:rFonts w:eastAsia="Times New Roman" w:cs="Arial"/>
+                <w:color w:val="000000"/>
+                <w:kern w:val="0"/>
+                <w:sz w:val="20"/>
+                <w:szCs w:val="20"/>
+                <w14:ligatures w14:val="none"/>
+              </w:rPr>
+            </w:pPr>
+            <w:r>
+              <w:rPr>
+                <w:rFonts w:eastAsia="Times New Roman" w:cs="Arial"/>
+                <w:color w:val="000000"/>
+                <w:kern w:val="0"/>
+                <w:sz w:val="20"/>
+                <w:szCs w:val="20"/>
+                <w14:ligatures w14:val="none"/>
+              </w:rPr>
+              <w:t xml:space="preserve">NCBI Entrez API (E-utilities) via </w:t>
+            </w:r>
             <w:r>
               <w:rPr>
                 <w:rFonts w:eastAsia="Times New Roman" w:cs="Arial"/>
@@ -1117,69 +1043,8 @@
                 <w:szCs w:val="16"/>
                 <w14:ligatures w14:val="none"/>
               </w:rPr>
-              <w:t>best_structures</w:t>
-            </w:r>
-            <w:proofErr w:type="spellEnd"/>
-            <w:r>
-              <w:rPr>
-                <w:rFonts w:eastAsia="Times New Roman" w:cs="Arial"/>
-                <w:color w:val="000000"/>
-                <w:kern w:val="0"/>
-                <w:sz w:val="16"/>
-                <w:szCs w:val="16"/>
-                <w14:ligatures w14:val="none"/>
-              </w:rPr>
-              <w:t>/)</w:t>
-            </w:r>
-          </w:p>
-        </w:tc>
-        <w:tc>
-          <w:tcPr>
-            <w:tcW w:w="0" w:type="auto"/>
-            <w:tcBorders>
-              <w:top w:val="nil"/>
-              <w:left w:val="nil"/>
-              <w:bottom w:val="single" w:sz="4" w:space="0" w:color="auto"/>
-              <w:right w:val="single" w:sz="4" w:space="0" w:color="auto"/>
-            </w:tcBorders>
-            <w:hideMark/>
-          </w:tcPr>
-          <w:p>
-            <w:pPr>
-              <w:spacing w:after="0" w:line="240" w:lineRule="auto"/>
-              <w:rPr>
-                <w:rFonts w:eastAsia="Times New Roman" w:cs="Arial"/>
-                <w:color w:val="000000"/>
-                <w:kern w:val="0"/>
-                <w:sz w:val="20"/>
-                <w:szCs w:val="20"/>
-                <w14:ligatures w14:val="none"/>
-              </w:rPr>
-            </w:pPr>
-            <w:r>
-              <w:rPr>
-                <w:rFonts w:eastAsia="Times New Roman" w:cs="Arial"/>
-                <w:color w:val="000000"/>
-                <w:kern w:val="0"/>
-                <w:sz w:val="20"/>
-                <w:szCs w:val="20"/>
-                <w14:ligatures w14:val="none"/>
-              </w:rPr>
-              <w:t xml:space="preserve">NCBI Entrez API (E-utilities) via </w:t>
-            </w:r>
-            <w:proofErr w:type="spellStart"/>
-            <w:r>
-              <w:rPr>
-                <w:rFonts w:eastAsia="Times New Roman" w:cs="Arial"/>
-                <w:color w:val="000000"/>
-                <w:kern w:val="0"/>
-                <w:sz w:val="16"/>
-                <w:szCs w:val="16"/>
-                <w14:ligatures w14:val="none"/>
-              </w:rPr>
               <w:t>Bio.Entrez</w:t>
             </w:r>
-            <w:proofErr w:type="spellEnd"/>
           </w:p>
         </w:tc>
       </w:tr>
@@ -1676,7 +1541,6 @@
                 <w14:ligatures w14:val="none"/>
               </w:rPr>
             </w:pPr>
-            <w:proofErr w:type="spellStart"/>
             <w:r>
               <w:rPr>
                 <w:rFonts w:eastAsia="Times New Roman" w:cs="Times New Roman"/>
@@ -1688,7 +1552,6 @@
               </w:rPr>
               <w:t>uniprot_id</w:t>
             </w:r>
-            <w:proofErr w:type="spellEnd"/>
             <w:r>
               <w:rPr>
                 <w:rFonts w:eastAsia="Times New Roman" w:cs="Arial"/>
@@ -1698,33 +1561,44 @@
                 <w:szCs w:val="16"/>
                 <w14:ligatures w14:val="none"/>
               </w:rPr>
-              <w:t xml:space="preserve">, </w:t>
-            </w:r>
-            <w:proofErr w:type="spellStart"/>
-            <w:r>
-              <w:rPr>
-                <w:rFonts w:eastAsia="Times New Roman" w:cs="Arial"/>
+              <w:t>, protein_name, gene_names, sequence, sequence_length, protein_families</w:t>
+            </w:r>
+          </w:p>
+        </w:tc>
+        <w:tc>
+          <w:tcPr>
+            <w:tcW w:w="2185" w:type="dxa"/>
+            <w:tcBorders>
+              <w:top w:val="single" w:sz="4" w:space="0" w:color="auto"/>
+              <w:left w:val="nil"/>
+              <w:bottom w:val="single" w:sz="4" w:space="0" w:color="auto"/>
+              <w:right w:val="single" w:sz="4" w:space="0" w:color="auto"/>
+            </w:tcBorders>
+            <w:hideMark/>
+          </w:tcPr>
+          <w:p>
+            <w:pPr>
+              <w:spacing w:after="0" w:line="240" w:lineRule="auto"/>
+              <w:rPr>
+                <w:rFonts w:eastAsia="Times New Roman" w:cs="Times New Roman"/>
                 <w:color w:val="000000"/>
                 <w:kern w:val="0"/>
                 <w:sz w:val="16"/>
                 <w:szCs w:val="16"/>
                 <w14:ligatures w14:val="none"/>
               </w:rPr>
-              <w:t>protein_name</w:t>
-            </w:r>
-            <w:proofErr w:type="spellEnd"/>
-            <w:r>
-              <w:rPr>
-                <w:rFonts w:eastAsia="Times New Roman" w:cs="Arial"/>
+            </w:pPr>
+            <w:r>
+              <w:rPr>
+                <w:rFonts w:eastAsia="Times New Roman" w:cs="Times New Roman"/>
                 <w:color w:val="000000"/>
                 <w:kern w:val="0"/>
                 <w:sz w:val="16"/>
                 <w:szCs w:val="16"/>
                 <w14:ligatures w14:val="none"/>
               </w:rPr>
-              <w:t xml:space="preserve">, </w:t>
-            </w:r>
-            <w:proofErr w:type="spellStart"/>
+              <w:t>drug_chembl_id</w:t>
+            </w:r>
             <w:r>
               <w:rPr>
                 <w:rFonts w:eastAsia="Times New Roman" w:cs="Arial"/>
@@ -1734,9 +1608,33 @@
                 <w:szCs w:val="16"/>
                 <w14:ligatures w14:val="none"/>
               </w:rPr>
-              <w:t>gene_names</w:t>
-            </w:r>
-            <w:proofErr w:type="spellEnd"/>
+              <w:t>, molecule_type, molecular_weight, canonical_smiles, standard_value, pchembl_value</w:t>
+            </w:r>
+          </w:p>
+        </w:tc>
+        <w:tc>
+          <w:tcPr>
+            <w:tcW w:w="0" w:type="auto"/>
+            <w:tcBorders>
+              <w:top w:val="single" w:sz="4" w:space="0" w:color="auto"/>
+              <w:left w:val="nil"/>
+              <w:bottom w:val="single" w:sz="4" w:space="0" w:color="auto"/>
+              <w:right w:val="single" w:sz="4" w:space="0" w:color="auto"/>
+            </w:tcBorders>
+            <w:hideMark/>
+          </w:tcPr>
+          <w:p>
+            <w:pPr>
+              <w:spacing w:after="0" w:line="240" w:lineRule="auto"/>
+              <w:rPr>
+                <w:rFonts w:eastAsia="Times New Roman" w:cs="Times New Roman"/>
+                <w:color w:val="000000"/>
+                <w:kern w:val="0"/>
+                <w:sz w:val="20"/>
+                <w:szCs w:val="20"/>
+                <w14:ligatures w14:val="none"/>
+              </w:rPr>
+            </w:pPr>
             <w:r>
               <w:rPr>
                 <w:rFonts w:eastAsia="Times New Roman" w:cs="Arial"/>
@@ -1746,9 +1644,44 @@
                 <w:szCs w:val="16"/>
                 <w14:ligatures w14:val="none"/>
               </w:rPr>
-              <w:t xml:space="preserve">, sequence, </w:t>
-            </w:r>
-            <w:proofErr w:type="spellStart"/>
+              <w:t>pdb_id, resolution, coverage, unp_start, unp_end,</w:t>
+            </w:r>
+            <w:r>
+              <w:rPr>
+                <w:rFonts w:eastAsia="Times New Roman" w:cs="Arial"/>
+                <w:color w:val="000000"/>
+                <w:kern w:val="0"/>
+                <w:sz w:val="20"/>
+                <w:szCs w:val="20"/>
+                <w14:ligatures w14:val="none"/>
+              </w:rPr>
+              <w:t xml:space="preserve"> experimental methods</w:t>
+            </w:r>
+          </w:p>
+        </w:tc>
+        <w:tc>
+          <w:tcPr>
+            <w:tcW w:w="0" w:type="auto"/>
+            <w:tcBorders>
+              <w:top w:val="single" w:sz="4" w:space="0" w:color="auto"/>
+              <w:left w:val="nil"/>
+              <w:bottom w:val="single" w:sz="4" w:space="0" w:color="auto"/>
+              <w:right w:val="single" w:sz="4" w:space="0" w:color="auto"/>
+            </w:tcBorders>
+            <w:hideMark/>
+          </w:tcPr>
+          <w:p>
+            <w:pPr>
+              <w:spacing w:after="0" w:line="240" w:lineRule="auto"/>
+              <w:rPr>
+                <w:rFonts w:eastAsia="Times New Roman" w:cs="Times New Roman"/>
+                <w:color w:val="000000"/>
+                <w:kern w:val="0"/>
+                <w:sz w:val="20"/>
+                <w:szCs w:val="20"/>
+                <w14:ligatures w14:val="none"/>
+              </w:rPr>
+            </w:pPr>
             <w:r>
               <w:rPr>
                 <w:rFonts w:eastAsia="Times New Roman" w:cs="Arial"/>
@@ -1758,371 +1691,7 @@
                 <w:szCs w:val="16"/>
                 <w14:ligatures w14:val="none"/>
               </w:rPr>
-              <w:t>sequence_length</w:t>
-            </w:r>
-            <w:proofErr w:type="spellEnd"/>
-            <w:r>
-              <w:rPr>
-                <w:rFonts w:eastAsia="Times New Roman" w:cs="Arial"/>
-                <w:color w:val="000000"/>
-                <w:kern w:val="0"/>
-                <w:sz w:val="16"/>
-                <w:szCs w:val="16"/>
-                <w14:ligatures w14:val="none"/>
-              </w:rPr>
-              <w:t xml:space="preserve">, </w:t>
-            </w:r>
-            <w:proofErr w:type="spellStart"/>
-            <w:r>
-              <w:rPr>
-                <w:rFonts w:eastAsia="Times New Roman" w:cs="Arial"/>
-                <w:color w:val="000000"/>
-                <w:kern w:val="0"/>
-                <w:sz w:val="16"/>
-                <w:szCs w:val="16"/>
-                <w14:ligatures w14:val="none"/>
-              </w:rPr>
-              <w:t>protein_families</w:t>
-            </w:r>
-            <w:proofErr w:type="spellEnd"/>
-          </w:p>
-        </w:tc>
-        <w:tc>
-          <w:tcPr>
-            <w:tcW w:w="2185" w:type="dxa"/>
-            <w:tcBorders>
-              <w:top w:val="single" w:sz="4" w:space="0" w:color="auto"/>
-              <w:left w:val="nil"/>
-              <w:bottom w:val="single" w:sz="4" w:space="0" w:color="auto"/>
-              <w:right w:val="single" w:sz="4" w:space="0" w:color="auto"/>
-            </w:tcBorders>
-            <w:hideMark/>
-          </w:tcPr>
-          <w:p>
-            <w:pPr>
-              <w:spacing w:after="0" w:line="240" w:lineRule="auto"/>
-              <w:rPr>
-                <w:rFonts w:eastAsia="Times New Roman" w:cs="Times New Roman"/>
-                <w:color w:val="000000"/>
-                <w:kern w:val="0"/>
-                <w:sz w:val="16"/>
-                <w:szCs w:val="16"/>
-                <w14:ligatures w14:val="none"/>
-              </w:rPr>
-            </w:pPr>
-            <w:proofErr w:type="spellStart"/>
-            <w:r>
-              <w:rPr>
-                <w:rFonts w:eastAsia="Times New Roman" w:cs="Times New Roman"/>
-                <w:color w:val="000000"/>
-                <w:kern w:val="0"/>
-                <w:sz w:val="16"/>
-                <w:szCs w:val="16"/>
-                <w14:ligatures w14:val="none"/>
-              </w:rPr>
-              <w:t>drug_chembl_id</w:t>
-            </w:r>
-            <w:proofErr w:type="spellEnd"/>
-            <w:r>
-              <w:rPr>
-                <w:rFonts w:eastAsia="Times New Roman" w:cs="Arial"/>
-                <w:color w:val="000000"/>
-                <w:kern w:val="0"/>
-                <w:sz w:val="16"/>
-                <w:szCs w:val="16"/>
-                <w14:ligatures w14:val="none"/>
-              </w:rPr>
-              <w:t xml:space="preserve">, </w:t>
-            </w:r>
-            <w:proofErr w:type="spellStart"/>
-            <w:r>
-              <w:rPr>
-                <w:rFonts w:eastAsia="Times New Roman" w:cs="Arial"/>
-                <w:color w:val="000000"/>
-                <w:kern w:val="0"/>
-                <w:sz w:val="16"/>
-                <w:szCs w:val="16"/>
-                <w14:ligatures w14:val="none"/>
-              </w:rPr>
-              <w:t>molecule_type</w:t>
-            </w:r>
-            <w:proofErr w:type="spellEnd"/>
-            <w:r>
-              <w:rPr>
-                <w:rFonts w:eastAsia="Times New Roman" w:cs="Arial"/>
-                <w:color w:val="000000"/>
-                <w:kern w:val="0"/>
-                <w:sz w:val="16"/>
-                <w:szCs w:val="16"/>
-                <w14:ligatures w14:val="none"/>
-              </w:rPr>
-              <w:t xml:space="preserve">, </w:t>
-            </w:r>
-            <w:proofErr w:type="spellStart"/>
-            <w:r>
-              <w:rPr>
-                <w:rFonts w:eastAsia="Times New Roman" w:cs="Arial"/>
-                <w:color w:val="000000"/>
-                <w:kern w:val="0"/>
-                <w:sz w:val="16"/>
-                <w:szCs w:val="16"/>
-                <w14:ligatures w14:val="none"/>
-              </w:rPr>
-              <w:t>molecular_weight</w:t>
-            </w:r>
-            <w:proofErr w:type="spellEnd"/>
-            <w:r>
-              <w:rPr>
-                <w:rFonts w:eastAsia="Times New Roman" w:cs="Arial"/>
-                <w:color w:val="000000"/>
-                <w:kern w:val="0"/>
-                <w:sz w:val="16"/>
-                <w:szCs w:val="16"/>
-                <w14:ligatures w14:val="none"/>
-              </w:rPr>
-              <w:t xml:space="preserve">, </w:t>
-            </w:r>
-            <w:proofErr w:type="spellStart"/>
-            <w:r>
-              <w:rPr>
-                <w:rFonts w:eastAsia="Times New Roman" w:cs="Arial"/>
-                <w:color w:val="000000"/>
-                <w:kern w:val="0"/>
-                <w:sz w:val="16"/>
-                <w:szCs w:val="16"/>
-                <w14:ligatures w14:val="none"/>
-              </w:rPr>
-              <w:t>canonical_smiles</w:t>
-            </w:r>
-            <w:proofErr w:type="spellEnd"/>
-            <w:r>
-              <w:rPr>
-                <w:rFonts w:eastAsia="Times New Roman" w:cs="Arial"/>
-                <w:color w:val="000000"/>
-                <w:kern w:val="0"/>
-                <w:sz w:val="16"/>
-                <w:szCs w:val="16"/>
-                <w14:ligatures w14:val="none"/>
-              </w:rPr>
-              <w:t xml:space="preserve">, </w:t>
-            </w:r>
-            <w:proofErr w:type="spellStart"/>
-            <w:r>
-              <w:rPr>
-                <w:rFonts w:eastAsia="Times New Roman" w:cs="Arial"/>
-                <w:color w:val="000000"/>
-                <w:kern w:val="0"/>
-                <w:sz w:val="16"/>
-                <w:szCs w:val="16"/>
-                <w14:ligatures w14:val="none"/>
-              </w:rPr>
-              <w:t>standard_value</w:t>
-            </w:r>
-            <w:proofErr w:type="spellEnd"/>
-            <w:r>
-              <w:rPr>
-                <w:rFonts w:eastAsia="Times New Roman" w:cs="Arial"/>
-                <w:color w:val="000000"/>
-                <w:kern w:val="0"/>
-                <w:sz w:val="16"/>
-                <w:szCs w:val="16"/>
-                <w14:ligatures w14:val="none"/>
-              </w:rPr>
-              <w:t xml:space="preserve">, </w:t>
-            </w:r>
-            <w:proofErr w:type="spellStart"/>
-            <w:r>
-              <w:rPr>
-                <w:rFonts w:eastAsia="Times New Roman" w:cs="Arial"/>
-                <w:color w:val="000000"/>
-                <w:kern w:val="0"/>
-                <w:sz w:val="16"/>
-                <w:szCs w:val="16"/>
-                <w14:ligatures w14:val="none"/>
-              </w:rPr>
-              <w:t>pchembl_value</w:t>
-            </w:r>
-            <w:proofErr w:type="spellEnd"/>
-          </w:p>
-        </w:tc>
-        <w:tc>
-          <w:tcPr>
-            <w:tcW w:w="0" w:type="auto"/>
-            <w:tcBorders>
-              <w:top w:val="single" w:sz="4" w:space="0" w:color="auto"/>
-              <w:left w:val="nil"/>
-              <w:bottom w:val="single" w:sz="4" w:space="0" w:color="auto"/>
-              <w:right w:val="single" w:sz="4" w:space="0" w:color="auto"/>
-            </w:tcBorders>
-            <w:hideMark/>
-          </w:tcPr>
-          <w:p>
-            <w:pPr>
-              <w:spacing w:after="0" w:line="240" w:lineRule="auto"/>
-              <w:rPr>
-                <w:rFonts w:eastAsia="Times New Roman" w:cs="Times New Roman"/>
-                <w:color w:val="000000"/>
-                <w:kern w:val="0"/>
-                <w:sz w:val="20"/>
-                <w:szCs w:val="20"/>
-                <w14:ligatures w14:val="none"/>
-              </w:rPr>
-            </w:pPr>
-            <w:proofErr w:type="spellStart"/>
-            <w:r>
-              <w:rPr>
-                <w:rFonts w:eastAsia="Times New Roman" w:cs="Arial"/>
-                <w:color w:val="000000"/>
-                <w:kern w:val="0"/>
-                <w:sz w:val="16"/>
-                <w:szCs w:val="16"/>
-                <w14:ligatures w14:val="none"/>
-              </w:rPr>
-              <w:t>pdb_id</w:t>
-            </w:r>
-            <w:proofErr w:type="spellEnd"/>
-            <w:r>
-              <w:rPr>
-                <w:rFonts w:eastAsia="Times New Roman" w:cs="Arial"/>
-                <w:color w:val="000000"/>
-                <w:kern w:val="0"/>
-                <w:sz w:val="16"/>
-                <w:szCs w:val="16"/>
-                <w14:ligatures w14:val="none"/>
-              </w:rPr>
-              <w:t xml:space="preserve">, resolution, coverage, </w:t>
-            </w:r>
-            <w:proofErr w:type="spellStart"/>
-            <w:r>
-              <w:rPr>
-                <w:rFonts w:eastAsia="Times New Roman" w:cs="Arial"/>
-                <w:color w:val="000000"/>
-                <w:kern w:val="0"/>
-                <w:sz w:val="16"/>
-                <w:szCs w:val="16"/>
-                <w14:ligatures w14:val="none"/>
-              </w:rPr>
-              <w:t>unp_start</w:t>
-            </w:r>
-            <w:proofErr w:type="spellEnd"/>
-            <w:r>
-              <w:rPr>
-                <w:rFonts w:eastAsia="Times New Roman" w:cs="Arial"/>
-                <w:color w:val="000000"/>
-                <w:kern w:val="0"/>
-                <w:sz w:val="16"/>
-                <w:szCs w:val="16"/>
-                <w14:ligatures w14:val="none"/>
-              </w:rPr>
-              <w:t xml:space="preserve">, </w:t>
-            </w:r>
-            <w:proofErr w:type="spellStart"/>
-            <w:r>
-              <w:rPr>
-                <w:rFonts w:eastAsia="Times New Roman" w:cs="Arial"/>
-                <w:color w:val="000000"/>
-                <w:kern w:val="0"/>
-                <w:sz w:val="16"/>
-                <w:szCs w:val="16"/>
-                <w14:ligatures w14:val="none"/>
-              </w:rPr>
-              <w:t>unp_end</w:t>
-            </w:r>
-            <w:proofErr w:type="spellEnd"/>
-            <w:r>
-              <w:rPr>
-                <w:rFonts w:eastAsia="Times New Roman" w:cs="Arial"/>
-                <w:color w:val="000000"/>
-                <w:kern w:val="0"/>
-                <w:sz w:val="16"/>
-                <w:szCs w:val="16"/>
-                <w14:ligatures w14:val="none"/>
-              </w:rPr>
-              <w:t>,</w:t>
-            </w:r>
-            <w:r>
-              <w:rPr>
-                <w:rFonts w:eastAsia="Times New Roman" w:cs="Arial"/>
-                <w:color w:val="000000"/>
-                <w:kern w:val="0"/>
-                <w:sz w:val="20"/>
-                <w:szCs w:val="20"/>
-                <w14:ligatures w14:val="none"/>
-              </w:rPr>
-              <w:t xml:space="preserve"> experimental methods</w:t>
-            </w:r>
-          </w:p>
-        </w:tc>
-        <w:tc>
-          <w:tcPr>
-            <w:tcW w:w="0" w:type="auto"/>
-            <w:tcBorders>
-              <w:top w:val="single" w:sz="4" w:space="0" w:color="auto"/>
-              <w:left w:val="nil"/>
-              <w:bottom w:val="single" w:sz="4" w:space="0" w:color="auto"/>
-              <w:right w:val="single" w:sz="4" w:space="0" w:color="auto"/>
-            </w:tcBorders>
-            <w:hideMark/>
-          </w:tcPr>
-          <w:p>
-            <w:pPr>
-              <w:spacing w:after="0" w:line="240" w:lineRule="auto"/>
-              <w:rPr>
-                <w:rFonts w:eastAsia="Times New Roman" w:cs="Times New Roman"/>
-                <w:color w:val="000000"/>
-                <w:kern w:val="0"/>
-                <w:sz w:val="20"/>
-                <w:szCs w:val="20"/>
-                <w14:ligatures w14:val="none"/>
-              </w:rPr>
-            </w:pPr>
-            <w:proofErr w:type="spellStart"/>
-            <w:r>
-              <w:rPr>
-                <w:rFonts w:eastAsia="Times New Roman" w:cs="Arial"/>
-                <w:color w:val="000000"/>
-                <w:kern w:val="0"/>
-                <w:sz w:val="16"/>
-                <w:szCs w:val="16"/>
-                <w14:ligatures w14:val="none"/>
-              </w:rPr>
-              <w:t>pubmed_id</w:t>
-            </w:r>
-            <w:proofErr w:type="spellEnd"/>
-            <w:r>
-              <w:rPr>
-                <w:rFonts w:eastAsia="Times New Roman" w:cs="Arial"/>
-                <w:color w:val="000000"/>
-                <w:kern w:val="0"/>
-                <w:sz w:val="16"/>
-                <w:szCs w:val="16"/>
-                <w14:ligatures w14:val="none"/>
-              </w:rPr>
-              <w:t xml:space="preserve">, </w:t>
-            </w:r>
-            <w:proofErr w:type="spellStart"/>
-            <w:r>
-              <w:rPr>
-                <w:rFonts w:eastAsia="Times New Roman" w:cs="Arial"/>
-                <w:color w:val="000000"/>
-                <w:kern w:val="0"/>
-                <w:sz w:val="16"/>
-                <w:szCs w:val="16"/>
-                <w14:ligatures w14:val="none"/>
-              </w:rPr>
-              <w:t>article_title</w:t>
-            </w:r>
-            <w:proofErr w:type="spellEnd"/>
-            <w:r>
-              <w:rPr>
-                <w:rFonts w:eastAsia="Times New Roman" w:cs="Arial"/>
-                <w:color w:val="000000"/>
-                <w:kern w:val="0"/>
-                <w:sz w:val="16"/>
-                <w:szCs w:val="16"/>
-                <w14:ligatures w14:val="none"/>
-              </w:rPr>
-              <w:t>, abstract, journal, authors,</w:t>
+              <w:t>pubmed_id, article_title, abstract, journal, authors,</w:t>
             </w:r>
             <w:r>
               <w:rPr>
@@ -2597,7 +2166,6 @@
               </w:rPr>
               <w:t>Base biological key (</w:t>
             </w:r>
-            <w:proofErr w:type="spellStart"/>
             <w:r>
               <w:rPr>
                 <w:rFonts w:eastAsia="Times New Roman" w:cs="Arial"/>
@@ -2609,7 +2177,6 @@
               </w:rPr>
               <w:t>uniprot_id</w:t>
             </w:r>
-            <w:proofErr w:type="spellEnd"/>
             <w:r>
               <w:rPr>
                 <w:rFonts w:eastAsia="Times New Roman" w:cs="Arial"/>
@@ -2619,55 +2186,7 @@
                 <w:szCs w:val="20"/>
                 <w14:ligatures w14:val="none"/>
               </w:rPr>
-              <w:t xml:space="preserve">). Links to </w:t>
-            </w:r>
-            <w:proofErr w:type="spellStart"/>
-            <w:r>
-              <w:rPr>
-                <w:rFonts w:eastAsia="Times New Roman" w:cs="Arial"/>
-                <w:color w:val="000000"/>
-                <w:kern w:val="0"/>
-                <w:sz w:val="20"/>
-                <w:szCs w:val="20"/>
-                <w14:ligatures w14:val="none"/>
-              </w:rPr>
-              <w:t>ChEMBL</w:t>
-            </w:r>
-            <w:proofErr w:type="spellEnd"/>
-            <w:r>
-              <w:rPr>
-                <w:rFonts w:eastAsia="Times New Roman" w:cs="Arial"/>
-                <w:color w:val="000000"/>
-                <w:kern w:val="0"/>
-                <w:sz w:val="20"/>
-                <w:szCs w:val="20"/>
-                <w14:ligatures w14:val="none"/>
-              </w:rPr>
-              <w:t xml:space="preserve"> &amp; </w:t>
-            </w:r>
-            <w:proofErr w:type="spellStart"/>
-            <w:r>
-              <w:rPr>
-                <w:rFonts w:eastAsia="Times New Roman" w:cs="Arial"/>
-                <w:color w:val="000000"/>
-                <w:kern w:val="0"/>
-                <w:sz w:val="20"/>
-                <w:szCs w:val="20"/>
-                <w14:ligatures w14:val="none"/>
-              </w:rPr>
-              <w:t>PDBe</w:t>
-            </w:r>
-            <w:proofErr w:type="spellEnd"/>
-            <w:r>
-              <w:rPr>
-                <w:rFonts w:eastAsia="Times New Roman" w:cs="Arial"/>
-                <w:color w:val="000000"/>
-                <w:kern w:val="0"/>
-                <w:sz w:val="20"/>
-                <w:szCs w:val="20"/>
-                <w14:ligatures w14:val="none"/>
-              </w:rPr>
-              <w:t>.</w:t>
+              <w:t>). Links to ChEMBL &amp; PDBe.</w:t>
             </w:r>
           </w:p>
         </w:tc>
@@ -2703,33 +2222,8 @@
                 <w:szCs w:val="20"/>
                 <w14:ligatures w14:val="none"/>
               </w:rPr>
-              <w:t xml:space="preserve">Links to </w:t>
-            </w:r>
-            <w:proofErr w:type="spellStart"/>
-            <w:r>
-              <w:rPr>
-                <w:rFonts w:eastAsia="Times New Roman" w:cs="Arial"/>
-                <w:color w:val="000000"/>
-                <w:kern w:val="0"/>
-                <w:sz w:val="20"/>
-                <w:szCs w:val="20"/>
-                <w14:ligatures w14:val="none"/>
-              </w:rPr>
-              <w:t>UniProt</w:t>
-            </w:r>
-            <w:proofErr w:type="spellEnd"/>
-            <w:r>
-              <w:rPr>
-                <w:rFonts w:eastAsia="Times New Roman" w:cs="Arial"/>
-                <w:color w:val="000000"/>
-                <w:kern w:val="0"/>
-                <w:sz w:val="20"/>
-                <w:szCs w:val="20"/>
-                <w14:ligatures w14:val="none"/>
-              </w:rPr>
-              <w:t xml:space="preserve"> (targets) and provides </w:t>
-            </w:r>
-            <w:proofErr w:type="spellStart"/>
+              <w:t xml:space="preserve">Links to UniProt (targets) and provides </w:t>
+            </w:r>
             <w:r>
               <w:rPr>
                 <w:rFonts w:eastAsia="Times New Roman" w:cs="Arial"/>
@@ -2741,7 +2235,6 @@
               </w:rPr>
               <w:t>pubmed_id</w:t>
             </w:r>
-            <w:proofErr w:type="spellEnd"/>
             <w:r>
               <w:rPr>
                 <w:rFonts w:eastAsia="Times New Roman" w:cs="Arial"/>
@@ -2789,7 +2282,6 @@
               </w:rPr>
               <w:t xml:space="preserve">Linked via </w:t>
             </w:r>
-            <w:proofErr w:type="spellStart"/>
             <w:r>
               <w:rPr>
                 <w:rFonts w:eastAsia="Times New Roman" w:cs="Arial"/>
@@ -2799,9 +2291,44 @@
                 <w:szCs w:val="16"/>
                 <w14:ligatures w14:val="none"/>
               </w:rPr>
-              <w:t>uniprot_id</w:t>
-            </w:r>
-            <w:proofErr w:type="spellEnd"/>
+              <w:t>uniprot_id.</w:t>
+            </w:r>
+          </w:p>
+        </w:tc>
+        <w:tc>
+          <w:tcPr>
+            <w:tcW w:w="0" w:type="auto"/>
+            <w:tcBorders>
+              <w:top w:val="single" w:sz="4" w:space="0" w:color="auto"/>
+              <w:left w:val="single" w:sz="4" w:space="0" w:color="auto"/>
+              <w:bottom w:val="single" w:sz="4" w:space="0" w:color="auto"/>
+              <w:right w:val="single" w:sz="4" w:space="0" w:color="auto"/>
+            </w:tcBorders>
+            <w:hideMark/>
+          </w:tcPr>
+          <w:p>
+            <w:pPr>
+              <w:spacing w:after="0" w:line="240" w:lineRule="auto"/>
+              <w:rPr>
+                <w:rFonts w:eastAsia="Times New Roman" w:cs="Arial"/>
+                <w:color w:val="000000"/>
+                <w:kern w:val="0"/>
+                <w:sz w:val="20"/>
+                <w:szCs w:val="20"/>
+                <w14:ligatures w14:val="none"/>
+              </w:rPr>
+            </w:pPr>
+            <w:r>
+              <w:rPr>
+                <w:rFonts w:eastAsia="Times New Roman" w:cs="Arial"/>
+                <w:color w:val="000000"/>
+                <w:kern w:val="0"/>
+                <w:sz w:val="20"/>
+                <w:szCs w:val="20"/>
+                <w14:ligatures w14:val="none"/>
+              </w:rPr>
+              <w:t xml:space="preserve">Linked to bioactivity facts via </w:t>
+            </w:r>
             <w:r>
               <w:rPr>
                 <w:rFonts w:eastAsia="Times New Roman" w:cs="Arial"/>
@@ -2811,67 +2338,7 @@
                 <w:szCs w:val="16"/>
                 <w14:ligatures w14:val="none"/>
               </w:rPr>
-              <w:t>.</w:t>
-            </w:r>
-          </w:p>
-        </w:tc>
-        <w:tc>
-          <w:tcPr>
-            <w:tcW w:w="0" w:type="auto"/>
-            <w:tcBorders>
-              <w:top w:val="single" w:sz="4" w:space="0" w:color="auto"/>
-              <w:left w:val="single" w:sz="4" w:space="0" w:color="auto"/>
-              <w:bottom w:val="single" w:sz="4" w:space="0" w:color="auto"/>
-              <w:right w:val="single" w:sz="4" w:space="0" w:color="auto"/>
-            </w:tcBorders>
-            <w:hideMark/>
-          </w:tcPr>
-          <w:p>
-            <w:pPr>
-              <w:spacing w:after="0" w:line="240" w:lineRule="auto"/>
-              <w:rPr>
-                <w:rFonts w:eastAsia="Times New Roman" w:cs="Arial"/>
-                <w:color w:val="000000"/>
-                <w:kern w:val="0"/>
-                <w:sz w:val="20"/>
-                <w:szCs w:val="20"/>
-                <w14:ligatures w14:val="none"/>
-              </w:rPr>
-            </w:pPr>
-            <w:r>
-              <w:rPr>
-                <w:rFonts w:eastAsia="Times New Roman" w:cs="Arial"/>
-                <w:color w:val="000000"/>
-                <w:kern w:val="0"/>
-                <w:sz w:val="20"/>
-                <w:szCs w:val="20"/>
-                <w14:ligatures w14:val="none"/>
-              </w:rPr>
-              <w:t xml:space="preserve">Linked to bioactivity facts via </w:t>
-            </w:r>
-            <w:proofErr w:type="spellStart"/>
-            <w:r>
-              <w:rPr>
-                <w:rFonts w:eastAsia="Times New Roman" w:cs="Arial"/>
-                <w:color w:val="000000"/>
-                <w:kern w:val="0"/>
-                <w:sz w:val="16"/>
-                <w:szCs w:val="16"/>
-                <w14:ligatures w14:val="none"/>
-              </w:rPr>
-              <w:t>pubmed_id</w:t>
-            </w:r>
-            <w:proofErr w:type="spellEnd"/>
-            <w:r>
-              <w:rPr>
-                <w:rFonts w:eastAsia="Times New Roman" w:cs="Arial"/>
-                <w:color w:val="000000"/>
-                <w:kern w:val="0"/>
-                <w:sz w:val="16"/>
-                <w:szCs w:val="16"/>
-                <w14:ligatures w14:val="none"/>
-              </w:rPr>
-              <w:t>.</w:t>
+              <w:t>pubmed_id.</w:t>
             </w:r>
           </w:p>
         </w:tc>
@@ -2922,48 +2389,10 @@
           <w:b/>
           <w:bCs/>
         </w:rPr>
-        <w:t>Integration</w:t>
-      </w:r>
-      <w:r>
-        <w:rPr>
-          <w:b/>
-          <w:bCs/>
-        </w:rPr>
-        <w:t xml:space="preserve"> Plan</w:t>
-      </w:r>
-      <w:r>
-        <w:rPr>
-          <w:b/>
-          <w:bCs/>
-        </w:rPr>
-        <w:t xml:space="preserve">: </w:t>
-      </w:r>
-      <w:r>
-        <w:t>Orchestrated the convergence of four isolated databases by establishing a central bioactivity Fact Table. This seamlessly mapped molecular targets (</w:t>
-      </w:r>
-      <w:proofErr w:type="spellStart"/>
-      <w:r>
-        <w:t>UniProt</w:t>
-      </w:r>
-      <w:proofErr w:type="spellEnd"/>
-      <w:r>
-        <w:t>), compound metrics (</w:t>
-      </w:r>
-      <w:proofErr w:type="spellStart"/>
-      <w:r>
-        <w:t>ChEMBL</w:t>
-      </w:r>
-      <w:proofErr w:type="spellEnd"/>
-      <w:r>
-        <w:t>), and 3D structures (</w:t>
-      </w:r>
-      <w:proofErr w:type="spellStart"/>
-      <w:r>
-        <w:t>PDBe</w:t>
-      </w:r>
-      <w:proofErr w:type="spellEnd"/>
-      <w:r>
-        <w:t>) directly to verifiable bibliographic records (PubMed).</w:t>
+        <w:t xml:space="preserve">Integration Plan: </w:t>
+      </w:r>
+      <w:r>
+        <w:t>Orchestrated the convergence of four isolated databases by establishing a central bioactivity Fact Table. This seamlessly mapped molecular targets (UniProt), compound metrics (ChEMBL), and 3D structures (PDBe) directly to verifiable bibliographic records (PubMed).</w:t>
       </w:r>
     </w:p>
     <w:p>
@@ -2982,15 +2411,7 @@
         <w:t xml:space="preserve">Logical Partitioning: </w:t>
       </w:r>
       <w:r>
-        <w:t xml:space="preserve">Filtered 4.3M "orphan" </w:t>
-      </w:r>
-      <w:proofErr w:type="spellStart"/>
-      <w:r>
-        <w:t>ChEMBL</w:t>
-      </w:r>
-      <w:proofErr w:type="spellEnd"/>
-      <w:r>
-        <w:t xml:space="preserve"> records for the IR pipeline while retaining them in the DWH for structural analytics.</w:t>
+        <w:t>Filtered 4.3M "orphan" ChEMBL records for the IR pipeline while retaining them in the DWH for structural analytics.</w:t>
       </w:r>
     </w:p>
     <w:p>
@@ -3110,23 +2531,7 @@
           <w:b/>
           <w:bCs/>
         </w:rPr>
-        <w:t>The Fact Table (</w:t>
-      </w:r>
-      <w:proofErr w:type="spellStart"/>
-      <w:r>
-        <w:rPr>
-          <w:b/>
-          <w:bCs/>
-        </w:rPr>
-        <w:t>fact_bioactivity</w:t>
-      </w:r>
-      <w:proofErr w:type="spellEnd"/>
-      <w:r>
-        <w:rPr>
-          <w:b/>
-          <w:bCs/>
-        </w:rPr>
-        <w:t>)</w:t>
+        <w:t>The Fact Table (fact_bioactivity)</w:t>
       </w:r>
     </w:p>
     <w:p>
@@ -3183,31 +2588,7 @@
         <w:t>Measures:</w:t>
       </w:r>
       <w:r>
-        <w:t xml:space="preserve"> Quantitative metrics (</w:t>
-      </w:r>
-      <w:proofErr w:type="spellStart"/>
-      <w:r>
-        <w:t>standard_value</w:t>
-      </w:r>
-      <w:proofErr w:type="spellEnd"/>
-      <w:r>
-        <w:t xml:space="preserve">, </w:t>
-      </w:r>
-      <w:proofErr w:type="spellStart"/>
-      <w:r>
-        <w:t>pchembl_value</w:t>
-      </w:r>
-      <w:proofErr w:type="spellEnd"/>
-      <w:r>
-        <w:t xml:space="preserve">, </w:t>
-      </w:r>
-      <w:proofErr w:type="spellStart"/>
-      <w:r>
-        <w:t>confidence_score</w:t>
-      </w:r>
-      <w:proofErr w:type="spellEnd"/>
-      <w:r>
-        <w:t>) and unit types.</w:t>
+        <w:t xml:space="preserve"> Quantitative metrics (standard_value, pchembl_value, confidence_score) and unit types.</w:t>
       </w:r>
     </w:p>
     <w:p>
@@ -3245,15 +2626,7 @@
         <w:t>Temporal Precision:</w:t>
       </w:r>
       <w:r>
-        <w:t xml:space="preserve"> Employs a </w:t>
-      </w:r>
-      <w:proofErr w:type="spellStart"/>
-      <w:r>
-        <w:t>date_precision</w:t>
-      </w:r>
-      <w:proofErr w:type="spellEnd"/>
-      <w:r>
-        <w:t xml:space="preserve"> flag (Exact, Month, Year) for partial dates. </w:t>
+        <w:t xml:space="preserve"> Employs a date_precision flag (Exact, Month, Year) for partial dates. </w:t>
       </w:r>
       <w:r>
         <w:t>M</w:t>
@@ -3290,29 +2663,8 @@
           <w:numId w:val="10"/>
         </w:numPr>
       </w:pPr>
-      <w:proofErr w:type="spellStart"/>
-      <w:r>
-        <w:t>dim_protein</w:t>
-      </w:r>
-      <w:proofErr w:type="spellEnd"/>
-      <w:r>
-        <w:t xml:space="preserve"> (Biological Targets): Human proteome attributes (sequence, </w:t>
-      </w:r>
-      <w:proofErr w:type="spellStart"/>
-      <w:r>
-        <w:t>sequence_length</w:t>
-      </w:r>
-      <w:proofErr w:type="spellEnd"/>
-      <w:r>
-        <w:t xml:space="preserve">, </w:t>
-      </w:r>
-      <w:proofErr w:type="spellStart"/>
-      <w:r>
-        <w:t>protein_families</w:t>
-      </w:r>
-      <w:proofErr w:type="spellEnd"/>
-      <w:r>
-        <w:t xml:space="preserve">). </w:t>
+      <w:r>
+        <w:t xml:space="preserve">dim_protein (Biological Targets): Human proteome attributes (sequence, sequence_length, protein_families). </w:t>
       </w:r>
       <w:r>
         <w:rPr>
@@ -3322,15 +2674,7 @@
         <w:t>Natural Key:</w:t>
       </w:r>
       <w:r>
-        <w:t xml:space="preserve"> </w:t>
-      </w:r>
-      <w:proofErr w:type="spellStart"/>
-      <w:r>
-        <w:t>uniprot_id</w:t>
-      </w:r>
-      <w:proofErr w:type="spellEnd"/>
-      <w:r>
-        <w:t>.</w:t>
+        <w:t xml:space="preserve"> uniprot_id.</w:t>
       </w:r>
     </w:p>
     <w:p>
@@ -3341,45 +2685,8 @@
           <w:numId w:val="10"/>
         </w:numPr>
       </w:pPr>
-      <w:proofErr w:type="spellStart"/>
-      <w:r>
-        <w:t>dim_drug</w:t>
-      </w:r>
-      <w:proofErr w:type="spellEnd"/>
-      <w:r>
-        <w:t xml:space="preserve"> (Chemical Compounds): Structural metadata (</w:t>
-      </w:r>
-      <w:proofErr w:type="spellStart"/>
-      <w:r>
-        <w:t>canonical_smiles</w:t>
-      </w:r>
-      <w:proofErr w:type="spellEnd"/>
-      <w:r>
-        <w:t xml:space="preserve">, </w:t>
-      </w:r>
-      <w:proofErr w:type="spellStart"/>
-      <w:r>
-        <w:t>standard_inchi_key</w:t>
-      </w:r>
-      <w:proofErr w:type="spellEnd"/>
-      <w:r>
-        <w:t>) and physiochemical properties (</w:t>
-      </w:r>
-      <w:proofErr w:type="spellStart"/>
-      <w:r>
-        <w:t>molecular_weight</w:t>
-      </w:r>
-      <w:proofErr w:type="spellEnd"/>
-      <w:r>
-        <w:t xml:space="preserve">, </w:t>
-      </w:r>
-      <w:proofErr w:type="spellStart"/>
-      <w:r>
-        <w:t>molecule_type</w:t>
-      </w:r>
-      <w:proofErr w:type="spellEnd"/>
-      <w:r>
-        <w:t xml:space="preserve">). </w:t>
+      <w:r>
+        <w:t xml:space="preserve">dim_drug (Chemical Compounds): Structural metadata (canonical_smiles, standard_inchi_key) and physiochemical properties (molecular_weight, molecule_type). </w:t>
       </w:r>
       <w:r>
         <w:rPr>
@@ -3389,15 +2696,7 @@
         <w:t>Natural Key:</w:t>
       </w:r>
       <w:r>
-        <w:t xml:space="preserve"> </w:t>
-      </w:r>
-      <w:proofErr w:type="spellStart"/>
-      <w:r>
-        <w:t>chembl_id</w:t>
-      </w:r>
-      <w:proofErr w:type="spellEnd"/>
-      <w:r>
-        <w:t>.</w:t>
+        <w:t xml:space="preserve"> chembl_id.</w:t>
       </w:r>
     </w:p>
     <w:p>
@@ -3408,13 +2707,8 @@
           <w:numId w:val="10"/>
         </w:numPr>
       </w:pPr>
-      <w:proofErr w:type="spellStart"/>
-      <w:r>
-        <w:t>dim_structure</w:t>
-      </w:r>
-      <w:proofErr w:type="spellEnd"/>
-      <w:r>
-        <w:t xml:space="preserve"> (3D Conformations): High-resolution physical mappings, storing resolution and experimental methods. </w:t>
+      <w:r>
+        <w:t xml:space="preserve">dim_structure (3D Conformations): High-resolution physical mappings, storing resolution and experimental methods. </w:t>
       </w:r>
       <w:r>
         <w:rPr>
@@ -3424,15 +2718,7 @@
         <w:t>Natural Key:</w:t>
       </w:r>
       <w:r>
-        <w:t xml:space="preserve"> </w:t>
-      </w:r>
-      <w:proofErr w:type="spellStart"/>
-      <w:r>
-        <w:t>pdb_id</w:t>
-      </w:r>
-      <w:proofErr w:type="spellEnd"/>
-      <w:r>
-        <w:t>.</w:t>
+        <w:t xml:space="preserve"> pdb_id.</w:t>
       </w:r>
     </w:p>
     <w:p>
@@ -3443,21 +2729,8 @@
           <w:numId w:val="10"/>
         </w:numPr>
       </w:pPr>
-      <w:proofErr w:type="spellStart"/>
-      <w:r>
-        <w:t>dim_article</w:t>
-      </w:r>
-      <w:proofErr w:type="spellEnd"/>
-      <w:r>
-        <w:t xml:space="preserve"> (Literature Context): Textual metadata powering the IR corpus (</w:t>
-      </w:r>
-      <w:proofErr w:type="spellStart"/>
-      <w:r>
-        <w:t>article_title</w:t>
-      </w:r>
-      <w:proofErr w:type="spellEnd"/>
-      <w:r>
-        <w:t xml:space="preserve">, journal, abstract, authors). </w:t>
+      <w:r>
+        <w:t xml:space="preserve">dim_article (Literature Context): Textual metadata powering the IR corpus (article_title, journal, abstract, authors). </w:t>
       </w:r>
       <w:r>
         <w:rPr>
@@ -3467,15 +2740,7 @@
         <w:t>Natural Key:</w:t>
       </w:r>
       <w:r>
-        <w:t xml:space="preserve"> </w:t>
-      </w:r>
-      <w:proofErr w:type="spellStart"/>
-      <w:r>
-        <w:t>pubmed_id</w:t>
-      </w:r>
-      <w:proofErr w:type="spellEnd"/>
-      <w:r>
-        <w:t>.</w:t>
+        <w:t xml:space="preserve"> pubmed_id.</w:t>
       </w:r>
     </w:p>
     <w:p>
@@ -3486,13 +2751,8 @@
           <w:numId w:val="10"/>
         </w:numPr>
       </w:pPr>
-      <w:proofErr w:type="spellStart"/>
-      <w:r>
-        <w:t>dim_date</w:t>
-      </w:r>
-      <w:proofErr w:type="spellEnd"/>
-      <w:r>
-        <w:t xml:space="preserve"> (Data-Driven &amp; Role-Playing): A dynamic, storage-optimized temporal dimension containing </w:t>
+      <w:r>
+        <w:t xml:space="preserve">dim_date (Data-Driven &amp; Role-Playing): A dynamic, storage-optimized temporal dimension containing </w:t>
       </w:r>
       <w:r>
         <w:rPr>
@@ -3502,23 +2762,7 @@
         <w:t>only</w:t>
       </w:r>
       <w:r>
-        <w:t xml:space="preserve"> dates present in the fact table. It utilizes an integer YYYYMMDD key to concurrently serve six chronological roles per fact record: publication, received, revised, accepted, </w:t>
-      </w:r>
-      <w:proofErr w:type="spellStart"/>
-      <w:r>
-        <w:t>epub</w:t>
-      </w:r>
-      <w:proofErr w:type="spellEnd"/>
-      <w:r>
-        <w:t xml:space="preserve">, and </w:t>
-      </w:r>
-      <w:proofErr w:type="spellStart"/>
-      <w:r>
-        <w:t>ppub</w:t>
-      </w:r>
-      <w:proofErr w:type="spellEnd"/>
-      <w:r>
-        <w:t>.</w:t>
+        <w:t xml:space="preserve"> dates present in the fact table. It utilizes an integer YYYYMMDD key to concurrently serve six chronological roles per fact record: publication, received, revised, accepted, epub, and ppub.</w:t>
       </w:r>
     </w:p>
     <w:p>
@@ -3704,21 +2948,12 @@
           <w:numId w:val="11"/>
         </w:numPr>
       </w:pPr>
-      <w:proofErr w:type="spellStart"/>
-      <w:r>
-        <w:rPr>
-          <w:b/>
-          <w:bCs/>
-        </w:rPr>
-        <w:t>UniProt</w:t>
-      </w:r>
-      <w:proofErr w:type="spellEnd"/>
-      <w:r>
-        <w:rPr>
-          <w:b/>
-          <w:bCs/>
-        </w:rPr>
-        <w:t xml:space="preserve"> (REST API):</w:t>
+      <w:r>
+        <w:rPr>
+          <w:b/>
+          <w:bCs/>
+        </w:rPr>
+        <w:t>UniProt (REST API):</w:t>
       </w:r>
       <w:r>
         <w:t xml:space="preserve"> Streamed human proteome features (sequence, families).</w:t>
@@ -3732,32 +2967,15 @@
           <w:numId w:val="11"/>
         </w:numPr>
       </w:pPr>
-      <w:proofErr w:type="spellStart"/>
-      <w:r>
-        <w:rPr>
-          <w:b/>
-          <w:bCs/>
-        </w:rPr>
-        <w:t>ChEMBL</w:t>
-      </w:r>
-      <w:proofErr w:type="spellEnd"/>
-      <w:r>
-        <w:rPr>
-          <w:b/>
-          <w:bCs/>
-        </w:rPr>
-        <w:t xml:space="preserve"> (SQLite/Parquet):</w:t>
-      </w:r>
-      <w:r>
-        <w:t xml:space="preserve"> Leveraged local Parquet </w:t>
-      </w:r>
-      <w:proofErr w:type="gramStart"/>
-      <w:r>
-        <w:t>caching</w:t>
-      </w:r>
-      <w:proofErr w:type="gramEnd"/>
-      <w:r>
-        <w:t xml:space="preserve"> for high-performance extraction of bioactivity metrics (IC</w:t>
+      <w:r>
+        <w:rPr>
+          <w:b/>
+          <w:bCs/>
+        </w:rPr>
+        <w:t>ChEMBL (SQLite/Parquet):</w:t>
+      </w:r>
+      <w:r>
+        <w:t xml:space="preserve"> Leveraged local Parquet caching for high-performance extraction of bioactivity metrics (IC</w:t>
       </w:r>
       <w:r>
         <w:rPr>
@@ -3786,21 +3004,12 @@
           <w:numId w:val="11"/>
         </w:numPr>
       </w:pPr>
-      <w:proofErr w:type="spellStart"/>
-      <w:r>
-        <w:rPr>
-          <w:b/>
-          <w:bCs/>
-        </w:rPr>
-        <w:t>PDBe</w:t>
-      </w:r>
-      <w:proofErr w:type="spellEnd"/>
-      <w:r>
-        <w:rPr>
-          <w:b/>
-          <w:bCs/>
-        </w:rPr>
-        <w:t xml:space="preserve"> (Graph API):</w:t>
+      <w:r>
+        <w:rPr>
+          <w:b/>
+          <w:bCs/>
+        </w:rPr>
+        <w:t>PDBe (Graph API):</w:t>
       </w:r>
       <w:r>
         <w:t xml:space="preserve"> Fetched high-resolution 3D structural parameters.</w:t>
@@ -3822,15 +3031,7 @@
         <w:t>PubMed (NCBI E-utilities):</w:t>
       </w:r>
       <w:r>
-        <w:t xml:space="preserve"> Extracted literature metadata and full XML abstracts via </w:t>
-      </w:r>
-      <w:proofErr w:type="spellStart"/>
-      <w:r>
-        <w:t>Bio.Entrez</w:t>
-      </w:r>
-      <w:proofErr w:type="spellEnd"/>
-      <w:r>
-        <w:t>.</w:t>
+        <w:t xml:space="preserve"> Extracted literature metadata and full XML abstracts via Bio.Entrez.</w:t>
       </w:r>
     </w:p>
     <w:p>
@@ -3845,20 +3046,7 @@
         <w:t xml:space="preserve"> </w:t>
       </w:r>
       <w:r>
-        <w:t xml:space="preserve">4 decoupled sets of immutable raw .csv </w:t>
-      </w:r>
-      <w:proofErr w:type="gramStart"/>
-      <w:r>
-        <w:t>and .</w:t>
-      </w:r>
-      <w:proofErr w:type="spellStart"/>
-      <w:r>
-        <w:t>json</w:t>
-      </w:r>
-      <w:proofErr w:type="spellEnd"/>
-      <w:proofErr w:type="gramEnd"/>
-      <w:r>
-        <w:t xml:space="preserve"> artifacts.</w:t>
+        <w:t>4 decoupled sets of immutable raw .csv and .json artifacts.</w:t>
       </w:r>
     </w:p>
     <w:p>
@@ -3901,15 +3089,7 @@
         <w:t xml:space="preserve">Type Safety &amp; Coercion: </w:t>
       </w:r>
       <w:r>
-        <w:t xml:space="preserve">Strings were cast to strict </w:t>
-      </w:r>
-      <w:proofErr w:type="spellStart"/>
-      <w:r>
-        <w:t>numerics</w:t>
-      </w:r>
-      <w:proofErr w:type="spellEnd"/>
-      <w:r>
-        <w:t xml:space="preserve"> (e.g., Float64 for molecular weights, nullable Int64 for years). String artifacts were sanitized, and missing data was preserved as pd.NA for native SQL NULL translation.</w:t>
+        <w:t>Strings were cast to strict numerics (e.g., Float64 for molecular weights, nullable Int64 for years). String artifacts were sanitized, and missing data was preserved as pd.NA for native SQL NULL translation.</w:t>
       </w:r>
     </w:p>
     <w:p>
@@ -3928,15 +3108,7 @@
         <w:t xml:space="preserve">Dimensional Mapping &amp; Imputation: </w:t>
       </w:r>
       <w:r>
-        <w:t xml:space="preserve">Natural string identifiers were mapped to optimized integer surrogate keys. Raw dates were formatted to YYYYMMDD integers, explicitly injecting the </w:t>
-      </w:r>
-      <w:proofErr w:type="gramStart"/>
-      <w:r>
-        <w:t>19000101 default</w:t>
-      </w:r>
-      <w:proofErr w:type="gramEnd"/>
-      <w:r>
-        <w:t xml:space="preserve"> anchor to safely initialize missing legacy PubMed temporal parameters without breaking SQL constraints.</w:t>
+        <w:t>Natural string identifiers were mapped to optimized integer surrogate keys. Raw dates were formatted to YYYYMMDD integers, explicitly injecting the 19000101 default anchor to safely initialize missing legacy PubMed temporal parameters without breaking SQL constraints.</w:t>
       </w:r>
     </w:p>
     <w:p>
@@ -3986,33 +3158,7 @@
     </w:p>
     <w:p>
       <w:r>
-        <w:t xml:space="preserve">To maximize I/O throughput, the custom </w:t>
-      </w:r>
-      <w:proofErr w:type="spellStart"/>
-      <w:r>
-        <w:t>WarehouseLoader</w:t>
-      </w:r>
-      <w:proofErr w:type="spellEnd"/>
-      <w:r>
-        <w:t xml:space="preserve"> intentionally bypassed heavy ORM layers (like </w:t>
-      </w:r>
-      <w:proofErr w:type="spellStart"/>
-      <w:r>
-        <w:t>SQLAlchemy</w:t>
-      </w:r>
-      <w:proofErr w:type="spellEnd"/>
-      <w:r>
-        <w:t xml:space="preserve">) in favor of native </w:t>
-      </w:r>
-      <w:proofErr w:type="spellStart"/>
-      <w:proofErr w:type="gramStart"/>
-      <w:r>
-        <w:t>mysql.connector</w:t>
-      </w:r>
-      <w:proofErr w:type="spellEnd"/>
-      <w:proofErr w:type="gramEnd"/>
-      <w:r>
-        <w:t>:</w:t>
+        <w:t>To maximize I/O throughput, the custom WarehouseLoader intentionally bypassed heavy ORM layers (like SQLAlchemy) in favor of native mysql.connector:</w:t>
       </w:r>
     </w:p>
     <w:p>
@@ -4028,44 +3174,10 @@
           <w:b/>
           <w:bCs/>
         </w:rPr>
-        <w:t xml:space="preserve">Idempotent Chunked </w:t>
-      </w:r>
-      <w:proofErr w:type="spellStart"/>
-      <w:r>
-        <w:rPr>
-          <w:b/>
-          <w:bCs/>
-        </w:rPr>
-        <w:t>Upserts</w:t>
-      </w:r>
-      <w:proofErr w:type="spellEnd"/>
-      <w:r>
-        <w:rPr>
-          <w:b/>
-          <w:bCs/>
-        </w:rPr>
-        <w:t xml:space="preserve">: </w:t>
-      </w:r>
-      <w:r>
-        <w:t>Data was streamed in strict memory chunks (</w:t>
-      </w:r>
-      <w:proofErr w:type="spellStart"/>
-      <w:r>
-        <w:t>chunksize</w:t>
-      </w:r>
-      <w:proofErr w:type="spellEnd"/>
-      <w:r>
-        <w:t xml:space="preserve">=10000) using parameterized </w:t>
-      </w:r>
-      <w:proofErr w:type="spellStart"/>
-      <w:proofErr w:type="gramStart"/>
-      <w:r>
-        <w:t>cursor.executemany</w:t>
-      </w:r>
-      <w:proofErr w:type="spellEnd"/>
-      <w:proofErr w:type="gramEnd"/>
-      <w:r>
-        <w:t>() with ON DUPLICATE KEY UPDATE logic.</w:t>
+        <w:t xml:space="preserve">Idempotent Chunked Upserts: </w:t>
+      </w:r>
+      <w:r>
+        <w:t>Data was streamed in strict memory chunks (chunksize=10000) using parameterized cursor.executemany() with ON DUPLICATE KEY UPDATE logic.</w:t>
       </w:r>
     </w:p>
     <w:p>
@@ -4084,15 +3196,7 @@
         <w:t xml:space="preserve">Constraint Enforcement: </w:t>
       </w:r>
       <w:r>
-        <w:t xml:space="preserve">Dimension tables were populated strictly before the central </w:t>
-      </w:r>
-      <w:proofErr w:type="spellStart"/>
-      <w:r>
-        <w:t>fact_bioactivity</w:t>
-      </w:r>
-      <w:proofErr w:type="spellEnd"/>
-      <w:r>
-        <w:t xml:space="preserve"> table to guarantee referential integrity at the database level.</w:t>
+        <w:t>Dimension tables were populated strictly before the central fact_bioactivity table to guarantee referential integrity at the database level.</w:t>
       </w:r>
     </w:p>
     <w:p>
@@ -4157,15 +3261,7 @@
         <w:t>Adaptive API Throttling:</w:t>
       </w:r>
       <w:r>
-        <w:t xml:space="preserve"> PubMed IDs were processed in dense batches (</w:t>
-      </w:r>
-      <w:proofErr w:type="spellStart"/>
-      <w:r>
-        <w:t>batch_size</w:t>
-      </w:r>
-      <w:proofErr w:type="spellEnd"/>
-      <w:r>
-        <w:t>=200) with exponential backoff to strictly respect NCBI rate limits (3 requests/sec).</w:t>
+        <w:t xml:space="preserve"> PubMed IDs were processed in dense batches (batch_size=200) with exponential backoff to strictly respect NCBI rate limits (3 requests/sec).</w:t>
       </w:r>
     </w:p>
     <w:p>
@@ -4183,23 +3279,7 @@
         <w:t>Two-Phase Staging Load:</w:t>
       </w:r>
       <w:r>
-        <w:t xml:space="preserve"> Utilized an ELT (Extract, Load, Transform) approach. Data was first written </w:t>
-      </w:r>
-      <w:proofErr w:type="gramStart"/>
-      <w:r>
-        <w:t>to</w:t>
-      </w:r>
-      <w:proofErr w:type="gramEnd"/>
-      <w:r>
-        <w:t xml:space="preserve"> a volatile staging table (</w:t>
-      </w:r>
-      <w:proofErr w:type="spellStart"/>
-      <w:r>
-        <w:t>stg_article_dates_enrichment</w:t>
-      </w:r>
-      <w:proofErr w:type="spellEnd"/>
-      <w:r>
-        <w:t>) via a Truncate-and-Load pattern. A high-performance SQL UPDATE-JOIN then propagated the surrogate temporal keys directly into the fact table.</w:t>
+        <w:t xml:space="preserve"> Utilized an ELT (Extract, Load, Transform) approach. Data was first written to a volatile staging table (stg_article_dates_enrichment) via a Truncate-and-Load pattern. A high-performance SQL UPDATE-JOIN then propagated the surrogate temporal keys directly into the fact table.</w:t>
       </w:r>
     </w:p>
     <w:p>
@@ -4270,39 +3350,7 @@
         <w:t>Join Optimization:</w:t>
       </w:r>
       <w:r>
-        <w:t xml:space="preserve"> Indices on foreign keys (</w:t>
-      </w:r>
-      <w:proofErr w:type="spellStart"/>
-      <w:r>
-        <w:t>idx_fact_article</w:t>
-      </w:r>
-      <w:proofErr w:type="spellEnd"/>
-      <w:r>
-        <w:t xml:space="preserve">, </w:t>
-      </w:r>
-      <w:proofErr w:type="spellStart"/>
-      <w:r>
-        <w:t>idx_fact_drug</w:t>
-      </w:r>
-      <w:proofErr w:type="spellEnd"/>
-      <w:r>
-        <w:t>) and role-playing temporal keys (</w:t>
-      </w:r>
-      <w:proofErr w:type="spellStart"/>
-      <w:r>
-        <w:t>idx_fact_pub_date</w:t>
-      </w:r>
-      <w:proofErr w:type="spellEnd"/>
-      <w:r>
-        <w:t xml:space="preserve">) successfully shifted retrieval complexity from O(N) (Full Table Scans) to </w:t>
-      </w:r>
-      <w:proofErr w:type="gramStart"/>
-      <w:r>
-        <w:t>O(</w:t>
-      </w:r>
-      <w:proofErr w:type="gramEnd"/>
-      <w:r>
-        <w:t>log N).</w:t>
+        <w:t xml:space="preserve"> Indices on foreign keys (idx_fact_article, idx_fact_drug) and role-playing temporal keys (idx_fact_pub_date) successfully shifted retrieval complexity from O(N) (Full Table Scans) to O(log N).</w:t>
       </w:r>
     </w:p>
     <w:p>
@@ -4348,15 +3396,7 @@
         <w:t>Orchestration &amp; Compute:</w:t>
       </w:r>
       <w:r>
-        <w:t xml:space="preserve"> Python 3, Pandas (vectorized transformations, </w:t>
-      </w:r>
-      <w:proofErr w:type="spellStart"/>
-      <w:r>
-        <w:t>downcasting</w:t>
-      </w:r>
-      <w:proofErr w:type="spellEnd"/>
-      <w:r>
-        <w:t>).</w:t>
+        <w:t xml:space="preserve"> Python 3, Pandas (vectorized transformations, downcasting).</w:t>
       </w:r>
     </w:p>
     <w:p>
@@ -4375,31 +3415,7 @@
         <w:t>Extraction:</w:t>
       </w:r>
       <w:r>
-        <w:t xml:space="preserve"> </w:t>
-      </w:r>
-      <w:proofErr w:type="spellStart"/>
-      <w:r>
-        <w:t>Biopython</w:t>
-      </w:r>
-      <w:proofErr w:type="spellEnd"/>
-      <w:r>
-        <w:t xml:space="preserve"> (</w:t>
-      </w:r>
-      <w:proofErr w:type="spellStart"/>
-      <w:r>
-        <w:t>Bio.Entrez</w:t>
-      </w:r>
-      <w:proofErr w:type="spellEnd"/>
-      <w:r>
-        <w:t xml:space="preserve">), Parquet (local </w:t>
-      </w:r>
-      <w:proofErr w:type="gramStart"/>
-      <w:r>
-        <w:t>caching</w:t>
-      </w:r>
-      <w:proofErr w:type="gramEnd"/>
-      <w:r>
-        <w:t>).</w:t>
+        <w:t xml:space="preserve"> Biopython (Bio.Entrez), Parquet (local caching).</w:t>
       </w:r>
     </w:p>
     <w:p>
@@ -4553,7 +3569,6 @@
           <w:numId w:val="14"/>
         </w:numPr>
       </w:pPr>
-      <w:proofErr w:type="spellStart"/>
       <w:r>
         <w:rPr>
           <w:b/>
@@ -4561,25 +3576,8 @@
         </w:rPr>
         <w:t>natural_keys</w:t>
       </w:r>
-      <w:proofErr w:type="spellEnd"/>
-      <w:r>
-        <w:t xml:space="preserve">: Arrays of strings (e.g., </w:t>
-      </w:r>
-      <w:proofErr w:type="spellStart"/>
-      <w:r>
-        <w:t>pubmed_id</w:t>
-      </w:r>
-      <w:proofErr w:type="spellEnd"/>
-      <w:r>
-        <w:t xml:space="preserve">, </w:t>
-      </w:r>
-      <w:proofErr w:type="spellStart"/>
-      <w:r>
-        <w:t>uniprot_ids</w:t>
-      </w:r>
-      <w:proofErr w:type="spellEnd"/>
-      <w:r>
-        <w:t>) enabling exact-match filtering for scientists searching by registry IDs.</w:t>
+      <w:r>
+        <w:t>: Arrays of strings (e.g., pubmed_id, uniprot_ids) enabling exact-match filtering for scientists searching by registry IDs.</w:t>
       </w:r>
     </w:p>
     <w:p>
@@ -4615,7 +3613,6 @@
           <w:numId w:val="14"/>
         </w:numPr>
       </w:pPr>
-      <w:proofErr w:type="spellStart"/>
       <w:r>
         <w:rPr>
           <w:b/>
@@ -4623,7 +3620,6 @@
         </w:rPr>
         <w:t>search_corpus</w:t>
       </w:r>
-      <w:proofErr w:type="spellEnd"/>
       <w:r>
         <w:t>: The unified, deduplicated flat text string ingested by the Vectorizer.</w:t>
       </w:r>
@@ -4644,23 +3640,7 @@
         <w:t>metrics</w:t>
       </w:r>
       <w:r>
-        <w:t xml:space="preserve">: Aggregated float values reserved for Hybrid Search sorting. Includes </w:t>
-      </w:r>
-      <w:proofErr w:type="spellStart"/>
-      <w:r>
-        <w:t>max_confidence</w:t>
-      </w:r>
-      <w:proofErr w:type="spellEnd"/>
-      <w:r>
-        <w:t xml:space="preserve"> (0-9 scale indicating target assignment certainty) and </w:t>
-      </w:r>
-      <w:proofErr w:type="spellStart"/>
-      <w:r>
-        <w:t>avg_pchembl</w:t>
-      </w:r>
-      <w:proofErr w:type="spellEnd"/>
-      <w:r>
-        <w:t xml:space="preserve"> (the continuous arithmetic mean of biological potency metrics like IC</w:t>
+        <w:t>: Aggregated float values reserved for Hybrid Search sorting. Includes max_confidence (0-9 scale indicating target assignment certainty) and avg_pchembl (the continuous arithmetic mean of biological potency metrics like IC</w:t>
       </w:r>
       <w:r>
         <w:rPr>
@@ -4959,7 +3939,6 @@
                 <w14:ligatures w14:val="none"/>
               </w:rPr>
             </w:pPr>
-            <w:proofErr w:type="spellStart"/>
             <w:r>
               <w:rPr>
                 <w:rFonts w:eastAsia="Times New Roman" w:cs="Times New Roman"/>
@@ -4971,7 +3950,6 @@
               </w:rPr>
               <w:t>article_title</w:t>
             </w:r>
-            <w:proofErr w:type="spellEnd"/>
           </w:p>
         </w:tc>
         <w:tc>
@@ -5023,7 +4001,6 @@
               </w:rPr>
               <w:t xml:space="preserve"> The title string is concatenated twice at the beginning of the </w:t>
             </w:r>
-            <w:proofErr w:type="spellStart"/>
             <w:r>
               <w:rPr>
                 <w:rFonts w:eastAsia="Times New Roman" w:cs="Arial"/>
@@ -5033,19 +4010,7 @@
                 <w:szCs w:val="16"/>
                 <w14:ligatures w14:val="none"/>
               </w:rPr>
-              <w:t>search_corpus</w:t>
-            </w:r>
-            <w:proofErr w:type="spellEnd"/>
-            <w:r>
-              <w:rPr>
-                <w:rFonts w:eastAsia="Times New Roman" w:cs="Arial"/>
-                <w:color w:val="000000"/>
-                <w:kern w:val="0"/>
-                <w:sz w:val="16"/>
-                <w:szCs w:val="16"/>
-                <w14:ligatures w14:val="none"/>
-              </w:rPr>
-              <w:t>.</w:t>
+              <w:t>search_corpus.</w:t>
             </w:r>
           </w:p>
         </w:tc>
@@ -5164,7 +4129,6 @@
               </w:rPr>
               <w:t>Extracted Entities (</w:t>
             </w:r>
-            <w:proofErr w:type="gramStart"/>
             <w:r>
               <w:rPr>
                 <w:rFonts w:eastAsia="Times New Roman" w:cs="Arial"/>
@@ -5174,43 +4138,7 @@
                 <w:szCs w:val="16"/>
                 <w14:ligatures w14:val="none"/>
               </w:rPr>
-              <w:t>Target:,</w:t>
-            </w:r>
-            <w:proofErr w:type="gramEnd"/>
-            <w:r>
-              <w:rPr>
-                <w:rFonts w:eastAsia="Times New Roman" w:cs="Arial"/>
-                <w:color w:val="000000"/>
-                <w:kern w:val="0"/>
-                <w:sz w:val="16"/>
-                <w:szCs w:val="16"/>
-                <w14:ligatures w14:val="none"/>
-              </w:rPr>
-              <w:t xml:space="preserve"> </w:t>
-            </w:r>
-            <w:proofErr w:type="gramStart"/>
-            <w:r>
-              <w:rPr>
-                <w:rFonts w:eastAsia="Times New Roman" w:cs="Arial"/>
-                <w:color w:val="000000"/>
-                <w:kern w:val="0"/>
-                <w:sz w:val="16"/>
-                <w:szCs w:val="16"/>
-                <w14:ligatures w14:val="none"/>
-              </w:rPr>
-              <w:t>Compound:,</w:t>
-            </w:r>
-            <w:proofErr w:type="gramEnd"/>
-            <w:r>
-              <w:rPr>
-                <w:rFonts w:eastAsia="Times New Roman" w:cs="Arial"/>
-                <w:color w:val="000000"/>
-                <w:kern w:val="0"/>
-                <w:sz w:val="16"/>
-                <w:szCs w:val="16"/>
-                <w14:ligatures w14:val="none"/>
-              </w:rPr>
-              <w:t xml:space="preserve"> Measurement:</w:t>
+              <w:t>Target:, Compound:, Measurement:</w:t>
             </w:r>
             <w:r>
               <w:rPr>
@@ -5334,7 +4262,6 @@
               </w:rPr>
               <w:t xml:space="preserve">By removing duplicate spam via Python </w:t>
             </w:r>
-            <w:proofErr w:type="gramStart"/>
             <w:r>
               <w:rPr>
                 <w:rFonts w:eastAsia="Times New Roman" w:cs="Arial"/>
@@ -5344,19 +4271,7 @@
                 <w:szCs w:val="16"/>
                 <w14:ligatures w14:val="none"/>
               </w:rPr>
-              <w:t>set(</w:t>
-            </w:r>
-            <w:proofErr w:type="gramEnd"/>
-            <w:r>
-              <w:rPr>
-                <w:rFonts w:eastAsia="Times New Roman" w:cs="Arial"/>
-                <w:color w:val="000000"/>
-                <w:kern w:val="0"/>
-                <w:sz w:val="16"/>
-                <w:szCs w:val="16"/>
-                <w14:ligatures w14:val="none"/>
-              </w:rPr>
-              <w:t>)</w:t>
+              <w:t>set()</w:t>
             </w:r>
             <w:r>
               <w:rPr>
@@ -5461,7 +4376,6 @@
               </w:rPr>
               <w:t xml:space="preserve">, </w:t>
             </w:r>
-            <w:proofErr w:type="spellStart"/>
             <w:r>
               <w:rPr>
                 <w:rFonts w:eastAsia="Times New Roman" w:cs="Times New Roman"/>
@@ -5473,7 +4387,6 @@
               </w:rPr>
               <w:t>assay_description</w:t>
             </w:r>
-            <w:proofErr w:type="spellEnd"/>
           </w:p>
         </w:tc>
         <w:tc>
@@ -5636,21 +4549,12 @@
           <w:numId w:val="15"/>
         </w:numPr>
       </w:pPr>
-      <w:proofErr w:type="spellStart"/>
-      <w:r>
-        <w:rPr>
-          <w:b/>
-          <w:bCs/>
-        </w:rPr>
-        <w:t>Stopword</w:t>
-      </w:r>
-      <w:proofErr w:type="spellEnd"/>
-      <w:r>
-        <w:rPr>
-          <w:b/>
-          <w:bCs/>
-        </w:rPr>
-        <w:t xml:space="preserve"> Filtering:</w:t>
+      <w:r>
+        <w:rPr>
+          <w:b/>
+          <w:bCs/>
+        </w:rPr>
+        <w:t>Stopword Filtering:</w:t>
       </w:r>
       <w:r>
         <w:t xml:space="preserve"> Applied standard English stop-words to eliminate linguistic noise. Domain-specific terms (e.g., "study", "assay", "inhibitor") were explicitly retained; the system relies on downstream Inverse Document Frequency (IDF) mechanics to penalize these naturally.</w:t>
@@ -5672,23 +4576,7 @@
         <w:t>Lemmatization:</w:t>
       </w:r>
       <w:r>
-        <w:t xml:space="preserve"> Deployed a WordNet </w:t>
-      </w:r>
-      <w:proofErr w:type="spellStart"/>
-      <w:r>
-        <w:t>Lemmatizer</w:t>
-      </w:r>
-      <w:proofErr w:type="spellEnd"/>
-      <w:r>
-        <w:t xml:space="preserve"> wrapped in a Python Least Recently Used (LRU) cache. This guaranteed that highly repetitive biological variations (e.g., "kinases" vs. "kinase") were mapped to their exact morphological roots at </w:t>
-      </w:r>
-      <w:proofErr w:type="gramStart"/>
-      <w:r>
-        <w:t>O(</w:t>
-      </w:r>
-      <w:proofErr w:type="gramEnd"/>
-      <w:r>
-        <w:t>1) lookup speed, drastically reducing processing time.</w:t>
+        <w:t xml:space="preserve"> Deployed a WordNet Lemmatizer wrapped in a Python Least Recently Used (LRU) cache. This guaranteed that highly repetitive biological variations (e.g., "kinases" vs. "kinase") were mapped to their exact morphological roots at O(1) lookup speed, drastically reducing processing time.</w:t>
       </w:r>
     </w:p>
     <w:p>
@@ -5708,15 +4596,7 @@
     </w:p>
     <w:p>
       <w:r>
-        <w:t>The indexer captures both Unigrams and Bigrams (</w:t>
-      </w:r>
-      <w:proofErr w:type="spellStart"/>
-      <w:r>
-        <w:t>ngram_range</w:t>
-      </w:r>
-      <w:proofErr w:type="spellEnd"/>
-      <w:r>
-        <w:t xml:space="preserve"> = (1, 2)). To optimize matrix sparsity and constrain RAM usage, strict document frequency boundaries were enforced:</w:t>
+        <w:t>The indexer captures both Unigrams and Bigrams (ngram_range = (1, 2)). To optimize matrix sparsity and constrain RAM usage, strict document frequency boundaries were enforced:</w:t>
       </w:r>
     </w:p>
     <w:p>
@@ -5726,21 +4606,12 @@
           <w:numId w:val="8"/>
         </w:numPr>
       </w:pPr>
-      <w:proofErr w:type="spellStart"/>
-      <w:r>
-        <w:rPr>
-          <w:b/>
-          <w:bCs/>
-        </w:rPr>
-        <w:t>min_df</w:t>
-      </w:r>
-      <w:proofErr w:type="spellEnd"/>
-      <w:r>
-        <w:rPr>
-          <w:b/>
-          <w:bCs/>
-        </w:rPr>
-        <w:t>=2</w:t>
+      <w:r>
+        <w:rPr>
+          <w:b/>
+          <w:bCs/>
+        </w:rPr>
+        <w:t>min_df=2</w:t>
       </w:r>
       <w:r>
         <w:t>: Eliminated isolated typos, unique protein hashes, and OCR errors.</w:t>
@@ -5753,21 +4624,12 @@
           <w:numId w:val="8"/>
         </w:numPr>
       </w:pPr>
-      <w:proofErr w:type="spellStart"/>
-      <w:r>
-        <w:rPr>
-          <w:b/>
-          <w:bCs/>
-        </w:rPr>
-        <w:t>max_df</w:t>
-      </w:r>
-      <w:proofErr w:type="spellEnd"/>
-      <w:r>
-        <w:rPr>
-          <w:b/>
-          <w:bCs/>
-        </w:rPr>
-        <w:t>=0.85</w:t>
+      <w:r>
+        <w:rPr>
+          <w:b/>
+          <w:bCs/>
+        </w:rPr>
+        <w:t>max_df=0.85</w:t>
       </w:r>
       <w:r>
         <w:t>: Automatically pruned ubiquitous academic boilerplate that appears in over 85% of documents.</w:t>
@@ -5790,15 +4652,7 @@
     </w:p>
     <w:p>
       <w:r>
-        <w:t xml:space="preserve">To bypass heavy computation during query execution, the preprocessed corpus was vectorized into three mathematically optimized artifacts and serialized to disk via </w:t>
-      </w:r>
-      <w:proofErr w:type="spellStart"/>
-      <w:r>
-        <w:t>joblib</w:t>
-      </w:r>
-      <w:proofErr w:type="spellEnd"/>
-      <w:r>
-        <w:t>:</w:t>
+        <w:t>To bypass heavy computation during query execution, the preprocessed corpus was vectorized into three mathematically optimized artifacts and serialized to disk via joblib:</w:t>
       </w:r>
     </w:p>
     <w:p>
@@ -5814,23 +4668,7 @@
           <w:b/>
           <w:bCs/>
         </w:rPr>
-        <w:t>Boolean Index (</w:t>
-      </w:r>
-      <w:proofErr w:type="spellStart"/>
-      <w:r>
-        <w:rPr>
-          <w:b/>
-          <w:bCs/>
-        </w:rPr>
-        <w:t>BoW</w:t>
-      </w:r>
-      <w:proofErr w:type="spellEnd"/>
-      <w:r>
-        <w:rPr>
-          <w:b/>
-          <w:bCs/>
-        </w:rPr>
-        <w:t>):</w:t>
+        <w:t>Boolean Index (BoW):</w:t>
       </w:r>
       <w:r>
         <w:t xml:space="preserve"> Stored in </w:t>
@@ -5916,15 +4754,7 @@
     </w:p>
     <w:p>
       <w:r>
-        <w:t xml:space="preserve">We implemented and compared three distinct retrieval models, progressing from strict </w:t>
-      </w:r>
-      <w:proofErr w:type="gramStart"/>
-      <w:r>
-        <w:t>exact-matching</w:t>
-      </w:r>
-      <w:proofErr w:type="gramEnd"/>
-      <w:r>
-        <w:t xml:space="preserve"> to advanced probabilistic ranking:</w:t>
+        <w:t>We implemented and compared three distinct retrieval models, progressing from strict exact-matching to advanced probabilistic ranking:</w:t>
       </w:r>
     </w:p>
     <w:p>
@@ -6036,15 +4866,7 @@
     </w:p>
     <w:p>
       <w:r>
-        <w:t xml:space="preserve">Evaluation was conducted using the TREC Pooling methodology. The </w:t>
-      </w:r>
-      <w:proofErr w:type="gramStart"/>
-      <w:r>
-        <w:t>Top-20</w:t>
-      </w:r>
-      <w:proofErr w:type="gramEnd"/>
-      <w:r>
-        <w:t xml:space="preserve"> results from three baseline models across 5 queries (q1 – q5) were merged, deduplicated, and blinded to establish an unbiased Ground Truth (QRELS) via AI-assisted and human validation.</w:t>
+        <w:t>Evaluation was conducted using the TREC Pooling methodology. The Top-20 results from three baseline models across 5 queries (q1 – q5) were merged, deduplicated, and blinded to establish an unbiased Ground Truth (QRELS) via AI-assisted and human validation.</w:t>
       </w:r>
     </w:p>
     <w:p>
@@ -6071,23 +4893,7 @@
           <w:b/>
           <w:bCs/>
         </w:rPr>
-        <w:t xml:space="preserve">Quantitative </w:t>
-      </w:r>
-      <w:proofErr w:type="gramStart"/>
-      <w:r>
-        <w:rPr>
-          <w:b/>
-          <w:bCs/>
-        </w:rPr>
-        <w:t>Results @</w:t>
-      </w:r>
-      <w:proofErr w:type="gramEnd"/>
-      <w:r>
-        <w:rPr>
-          <w:b/>
-          <w:bCs/>
-        </w:rPr>
-        <w:t>K=10</w:t>
+        <w:t>Quantitative Results @K=10</w:t>
       </w:r>
       <w:r>
         <w:rPr>
@@ -7181,15 +5987,7 @@
         <w:t>The Recall Ceiling:</w:t>
       </w:r>
       <w:r>
-        <w:t xml:space="preserve"> Despite perfect precision, Recall is mathematically capped by the k=10 depth constraint. If the Ground Truth contains &gt;10 relevant articles (e.g., 40 in q2), a strict </w:t>
-      </w:r>
-      <w:proofErr w:type="gramStart"/>
-      <w:r>
-        <w:t>Top-10</w:t>
-      </w:r>
-      <w:proofErr w:type="gramEnd"/>
-      <w:r>
-        <w:t xml:space="preserve"> output fundamentally cannot exceed a Recall of 0.25.</w:t>
+        <w:t xml:space="preserve"> Despite perfect precision, Recall is mathematically capped by the k=10 depth constraint. If the Ground Truth contains &gt;10 relevant articles (e.g., 40 in q2), a strict Top-10 output fundamentally cannot exceed a Recall of 0.25.</w:t>
       </w:r>
     </w:p>
     <w:p>
@@ -7297,15 +6095,7 @@
     </w:p>
     <w:p>
       <w:r>
-        <w:t xml:space="preserve">To </w:t>
-      </w:r>
-      <w:proofErr w:type="gramStart"/>
-      <w:r>
-        <w:t>perform</w:t>
-      </w:r>
-      <w:proofErr w:type="gramEnd"/>
-      <w:r>
-        <w:t xml:space="preserve"> head-to-head comparison between our best lexical model (BM25) and the Neural Indexer, we developed a new Balanced Query Set (bq1</w:t>
+        <w:t>To perform head-to-head comparison between our best lexical model (BM25) and the Neural Indexer, we developed a new Balanced Query Set (bq1</w:t>
       </w:r>
       <w:r>
         <w:t>-</w:t>
@@ -7365,23 +6155,7 @@
           <w:b/>
           <w:bCs/>
         </w:rPr>
-        <w:t xml:space="preserve">Mean Lexical vs. Semantic </w:t>
-      </w:r>
-      <w:proofErr w:type="gramStart"/>
-      <w:r>
-        <w:rPr>
-          <w:b/>
-          <w:bCs/>
-        </w:rPr>
-        <w:t>Performance (@</w:t>
-      </w:r>
-      <w:proofErr w:type="gramEnd"/>
-      <w:r>
-        <w:rPr>
-          <w:b/>
-          <w:bCs/>
-        </w:rPr>
-        <w:t>K=10)</w:t>
+        <w:t>Mean Lexical vs. Semantic Performance (@K=10)</w:t>
       </w:r>
       <w:r>
         <w:rPr>
@@ -8295,23 +7069,7 @@
         <w:t>Vocabulary Gap Bridged:</w:t>
       </w:r>
       <w:r>
-        <w:t xml:space="preserve"> Neural achieved perfect </w:t>
-      </w:r>
-      <w:proofErr w:type="spellStart"/>
-      <w:r>
-        <w:t>nDCG</w:t>
-      </w:r>
-      <w:proofErr w:type="spellEnd"/>
-      <w:r>
-        <w:t xml:space="preserve"> (1.000) on query bq4 ("high blood pressure"), successfully retrieving "hypertension" literature where BM25 failed severely (</w:t>
-      </w:r>
-      <w:proofErr w:type="spellStart"/>
-      <w:r>
-        <w:t>nDCG</w:t>
-      </w:r>
-      <w:proofErr w:type="spellEnd"/>
-      <w:r>
-        <w:t xml:space="preserve"> = 0.228).</w:t>
+        <w:t xml:space="preserve"> Neural achieved perfect nDCG (1.000) on query bq4 ("high blood pressure"), successfully retrieving "hypertension" literature where BM25 failed severely (nDCG = 0.228).</w:t>
       </w:r>
     </w:p>
     <w:p>
@@ -8349,15 +7107,7 @@
         <w:t>Superior Ranking:</w:t>
       </w:r>
       <w:r>
-        <w:t xml:space="preserve"> The Neural model’s overall +11.2% </w:t>
-      </w:r>
-      <w:proofErr w:type="spellStart"/>
-      <w:r>
-        <w:t>nDCG</w:t>
-      </w:r>
-      <w:proofErr w:type="spellEnd"/>
-      <w:r>
-        <w:t xml:space="preserve"> improvement proves its capacity to push contextually relevant matches into the absolute top positions.</w:t>
+        <w:t xml:space="preserve"> The Neural model’s overall +11.2% nDCG improvement proves its capacity to push contextually relevant matches into the absolute top positions.</w:t>
       </w:r>
     </w:p>
     <w:p>
@@ -8569,35 +7319,7 @@
                 <w:szCs w:val="20"/>
                 <w14:ligatures w14:val="none"/>
               </w:rPr>
-              <w:t xml:space="preserve">Mean </w:t>
-            </w:r>
-            <w:proofErr w:type="gramStart"/>
-            <w:r>
-              <w:rPr>
-                <w:rFonts w:ascii="Aptos" w:eastAsia="Times New Roman" w:hAnsi="Aptos" w:cs="Times New Roman"/>
-                <w:b/>
-                <w:bCs/>
-                <w:color w:val="000000"/>
-                <w:kern w:val="0"/>
-                <w:sz w:val="20"/>
-                <w:szCs w:val="20"/>
-                <w14:ligatures w14:val="none"/>
-              </w:rPr>
-              <w:t>Metric (@</w:t>
-            </w:r>
-            <w:proofErr w:type="gramEnd"/>
-            <w:r>
-              <w:rPr>
-                <w:rFonts w:ascii="Aptos" w:eastAsia="Times New Roman" w:hAnsi="Aptos" w:cs="Times New Roman"/>
-                <w:b/>
-                <w:bCs/>
-                <w:color w:val="000000"/>
-                <w:kern w:val="0"/>
-                <w:sz w:val="20"/>
-                <w:szCs w:val="20"/>
-                <w14:ligatures w14:val="none"/>
-              </w:rPr>
-              <w:t>K=20)</w:t>
+              <w:t>Mean Metric (@K=20)</w:t>
             </w:r>
           </w:p>
         </w:tc>
@@ -9247,7 +7969,6 @@
                 <w14:ligatures w14:val="none"/>
               </w:rPr>
             </w:pPr>
-            <w:proofErr w:type="spellStart"/>
             <w:r>
               <w:rPr>
                 <w:rFonts w:ascii="Aptos" w:eastAsia="Times New Roman" w:hAnsi="Aptos" w:cs="Times New Roman"/>
@@ -9261,7 +7982,6 @@
               </w:rPr>
               <w:t>nDCG</w:t>
             </w:r>
-            <w:proofErr w:type="spellEnd"/>
           </w:p>
         </w:tc>
         <w:tc>
@@ -9570,21 +8290,12 @@
           <w:numId w:val="21"/>
         </w:numPr>
       </w:pPr>
-      <w:proofErr w:type="gramStart"/>
-      <w:r>
-        <w:rPr>
-          <w:b/>
-          <w:bCs/>
-        </w:rPr>
-        <w:t>Top-5</w:t>
-      </w:r>
-      <w:proofErr w:type="gramEnd"/>
-      <w:r>
-        <w:rPr>
-          <w:b/>
-          <w:bCs/>
-        </w:rPr>
-        <w:t xml:space="preserve"> Dominance:</w:t>
+      <w:r>
+        <w:rPr>
+          <w:b/>
+          <w:bCs/>
+        </w:rPr>
+        <w:t>Top-5 Dominance:</w:t>
       </w:r>
       <w:r>
         <w:t xml:space="preserve"> RRF enforces consensus between lexical and semantic pipelines, pushing universally relevant documents to the absolute top. This yields an unmatched, state-of-the-art </w:t>
@@ -9608,21 +8319,12 @@
           <w:numId w:val="21"/>
         </w:numPr>
       </w:pPr>
-      <w:proofErr w:type="gramStart"/>
-      <w:r>
-        <w:rPr>
-          <w:b/>
-          <w:bCs/>
-        </w:rPr>
-        <w:t>The K</w:t>
-      </w:r>
-      <w:proofErr w:type="gramEnd"/>
-      <w:r>
-        <w:rPr>
-          <w:b/>
-          <w:bCs/>
-        </w:rPr>
-        <w:t>=20 Penalty:</w:t>
+      <w:r>
+        <w:rPr>
+          <w:b/>
+          <w:bCs/>
+        </w:rPr>
+        <w:t>The K=20 Penalty:</w:t>
       </w:r>
       <w:r>
         <w:t xml:space="preserve"> Documents retrieved by only a single pipeline are mathematically penalized and pushed deeper. This causes a temporary, isolated dip in raw intersection metrics exactly at the K=20 mark.</w:t>
@@ -9666,23 +8368,7 @@
         <w:t>Conclusion:</w:t>
       </w:r>
       <w:r>
-        <w:t xml:space="preserve"> The Hybrid ensemble is the superior production system. It trades a minor mid-curve mathematical dip (K=20) for maximum immediate relevance for the end-user (</w:t>
-      </w:r>
-      <w:proofErr w:type="gramStart"/>
-      <w:r>
-        <w:t>Top-5</w:t>
-      </w:r>
-      <w:proofErr w:type="gramEnd"/>
-      <w:r>
-        <w:t>) and absolute literature coverage for deep scientific research (</w:t>
-      </w:r>
-      <w:proofErr w:type="gramStart"/>
-      <w:r>
-        <w:t>Top-100</w:t>
-      </w:r>
-      <w:proofErr w:type="gramEnd"/>
-      <w:r>
-        <w:t>).</w:t>
+        <w:t xml:space="preserve"> The Hybrid ensemble is the superior production system. It trades a minor mid-curve mathematical dip (K=20) for maximum immediate relevance for the end-user (Top-5) and absolute literature coverage for deep scientific research (Top-100).</w:t>
       </w:r>
     </w:p>
     <w:p>
@@ -9730,28 +8416,12 @@
     </w:p>
     <w:p>
       <w:r>
-        <w:t xml:space="preserve">Engineered a </w:t>
-      </w:r>
-      <w:proofErr w:type="spellStart"/>
-      <w:r>
-        <w:t>Jupyter</w:t>
-      </w:r>
-      <w:proofErr w:type="spellEnd"/>
-      <w:r>
-        <w:t>-based search lab for real-time model comparison, featuring dynamic PubMed/DOI hyperlinking for immediate source literature validation.</w:t>
-      </w:r>
-    </w:p>
-    <w:p>
-      <w:r>
-        <w:t xml:space="preserve">To run it please follow the </w:t>
-      </w:r>
-      <w:proofErr w:type="gramStart"/>
-      <w:r>
-        <w:t>instruction</w:t>
-      </w:r>
-      <w:proofErr w:type="gramEnd"/>
-      <w:r>
-        <w:t xml:space="preserve"> below</w:t>
+        <w:t>Engineered a Jupyter-based search lab for real-time model comparison, featuring dynamic PubMed/DOI hyperlinking for immediate source literature validation.</w:t>
+      </w:r>
+    </w:p>
+    <w:p>
+      <w:r>
+        <w:t>To run it please follow the instruction below</w:t>
       </w:r>
     </w:p>
     <w:p>
@@ -9815,7 +8485,7 @@
           <w:noProof/>
         </w:rPr>
         <w:drawing>
-          <wp:inline distT="0" distB="0" distL="0" distR="0" wp14:anchorId="38249500" wp14:editId="24AD8EE5">
+          <wp:inline distT="0" distB="0" distL="0" distR="0" wp14:anchorId="38249500" wp14:editId="496B4E6D">
             <wp:extent cx="2932236" cy="4809104"/>
             <wp:effectExtent l="0" t="0" r="0" b="0"/>
             <wp:docPr id="500181854" name="Picture 26"/>
@@ -9869,23 +8539,7 @@
         <w:ind w:left="720"/>
       </w:pPr>
       <w:r>
-        <w:t xml:space="preserve">Note: If you are using </w:t>
-      </w:r>
-      <w:proofErr w:type="spellStart"/>
-      <w:r>
-        <w:t>Jupyter</w:t>
-      </w:r>
-      <w:proofErr w:type="spellEnd"/>
-      <w:r>
-        <w:t xml:space="preserve"> Lab, ensure the </w:t>
-      </w:r>
-      <w:proofErr w:type="spellStart"/>
-      <w:r>
-        <w:t>ipywidgets</w:t>
-      </w:r>
-      <w:proofErr w:type="spellEnd"/>
-      <w:r>
-        <w:t xml:space="preserve"> extension is enabled.</w:t>
+        <w:t>Note: If you are using Jupyter Lab, ensure the ipywidgets extension is enabled.</w:t>
       </w:r>
     </w:p>
     <w:p>
@@ -9927,7 +8581,6 @@
       <w:r>
         <w:t>Open the notebook notebooks/</w:t>
       </w:r>
-      <w:proofErr w:type="spellStart"/>
       <w:r>
         <w:rPr>
           <w:b/>
@@ -9935,7 +8588,6 @@
         </w:rPr>
         <w:t>IR_pipeline.ipynb</w:t>
       </w:r>
-      <w:proofErr w:type="spellEnd"/>
       <w:r>
         <w:t>.</w:t>
       </w:r>
@@ -10038,7 +8690,7 @@
           <w:highlight w:val="green"/>
         </w:rPr>
         <w:drawing>
-          <wp:inline distT="0" distB="0" distL="0" distR="0" wp14:anchorId="190F4F63" wp14:editId="055EE616">
+          <wp:inline distT="0" distB="0" distL="0" distR="0" wp14:anchorId="190F4F63" wp14:editId="48503E1A">
             <wp:extent cx="6638290" cy="6059170"/>
             <wp:effectExtent l="0" t="0" r="0" b="0"/>
             <wp:docPr id="2144493785" name="Picture 24"/>
@@ -10329,20 +8981,7 @@
         <w:t>2. Storage Compression &amp; Integrity Metrics:</w:t>
       </w:r>
       <w:r>
-        <w:t xml:space="preserve"> The dynamic Role-Playing Star Schema demonstrated massive storage compression. The automated integrity tests (</w:t>
-      </w:r>
-      <w:proofErr w:type="spellStart"/>
-      <w:proofErr w:type="gramStart"/>
-      <w:r>
-        <w:t>src.etl.enrichment</w:t>
-      </w:r>
-      <w:proofErr w:type="gramEnd"/>
-      <w:r>
-        <w:t>.validation</w:t>
-      </w:r>
-      <w:proofErr w:type="spellEnd"/>
-      <w:r>
-        <w:t>) confirmed:</w:t>
+        <w:t xml:space="preserve"> The dynamic Role-Playing Star Schema demonstrated massive storage compression. The automated integrity tests (src.etl.enrichment.validation) confirmed:</w:t>
       </w:r>
     </w:p>
     <w:p>
@@ -10379,15 +9018,7 @@
         <w:t>Macro Compression:</w:t>
       </w:r>
       <w:r>
-        <w:t xml:space="preserve"> A highly compact </w:t>
-      </w:r>
-      <w:proofErr w:type="spellStart"/>
-      <w:r>
-        <w:t>dim_date</w:t>
-      </w:r>
-      <w:proofErr w:type="spellEnd"/>
-      <w:r>
-        <w:t xml:space="preserve"> table of exactly </w:t>
+        <w:t xml:space="preserve"> A highly compact dim_date table of exactly </w:t>
       </w:r>
       <w:r>
         <w:rPr>
@@ -10512,15 +9143,7 @@
         <w:t>L</w:t>
       </w:r>
       <w:r>
-        <w:t xml:space="preserve"> document. High-value categorical fields employ Dual Routing: they are stored as exact arrays in metadata for UI filtering, and as natural-language prefixed strings in </w:t>
-      </w:r>
-      <w:proofErr w:type="spellStart"/>
-      <w:r>
-        <w:t>search_corpus</w:t>
-      </w:r>
-      <w:proofErr w:type="spellEnd"/>
-      <w:r>
-        <w:t xml:space="preserve"> for lexical matching.</w:t>
+        <w:t xml:space="preserve"> document. High-value categorical fields employ Dual Routing: they are stored as exact arrays in metadata for UI filtering, and as natural-language prefixed strings in search_corpus for lexical matching.</w:t>
       </w:r>
     </w:p>
     <w:tbl>
@@ -10729,7 +9352,6 @@
                 <w14:ligatures w14:val="none"/>
               </w:rPr>
             </w:pPr>
-            <w:proofErr w:type="spellStart"/>
             <w:r>
               <w:rPr>
                 <w:rFonts w:ascii="Aptos" w:eastAsia="Times New Roman" w:hAnsi="Aptos" w:cs="Times New Roman"/>
@@ -10743,7 +9365,6 @@
               </w:rPr>
               <w:t>dim_article</w:t>
             </w:r>
-            <w:proofErr w:type="spellEnd"/>
           </w:p>
         </w:tc>
         <w:tc>
@@ -10769,7 +9390,6 @@
                 <w14:ligatures w14:val="none"/>
               </w:rPr>
             </w:pPr>
-            <w:proofErr w:type="spellStart"/>
             <w:r>
               <w:rPr>
                 <w:rFonts w:ascii="Aptos" w:eastAsia="Times New Roman" w:hAnsi="Aptos" w:cs="Times New Roman"/>
@@ -10781,7 +9401,6 @@
               </w:rPr>
               <w:t>pubmed_id</w:t>
             </w:r>
-            <w:proofErr w:type="spellEnd"/>
           </w:p>
         </w:tc>
         <w:tc>
@@ -10807,43 +9426,17 @@
                 <w14:ligatures w14:val="none"/>
               </w:rPr>
             </w:pPr>
-            <w:proofErr w:type="spellStart"/>
-            <w:r>
-              <w:rPr>
-                <w:rFonts w:ascii="Aptos" w:eastAsia="Times New Roman" w:hAnsi="Aptos" w:cs="Times New Roman"/>
-                <w:color w:val="000000"/>
-                <w:kern w:val="0"/>
-                <w:sz w:val="20"/>
-                <w:szCs w:val="20"/>
-                <w14:ligatures w14:val="none"/>
-              </w:rPr>
-              <w:t>natural_</w:t>
-            </w:r>
-            <w:proofErr w:type="gramStart"/>
-            <w:r>
-              <w:rPr>
-                <w:rFonts w:ascii="Aptos" w:eastAsia="Times New Roman" w:hAnsi="Aptos" w:cs="Times New Roman"/>
-                <w:color w:val="000000"/>
-                <w:kern w:val="0"/>
-                <w:sz w:val="20"/>
-                <w:szCs w:val="20"/>
-                <w14:ligatures w14:val="none"/>
-              </w:rPr>
-              <w:t>keys.pubmed</w:t>
-            </w:r>
-            <w:proofErr w:type="gramEnd"/>
-            <w:r>
-              <w:rPr>
-                <w:rFonts w:ascii="Aptos" w:eastAsia="Times New Roman" w:hAnsi="Aptos" w:cs="Times New Roman"/>
-                <w:color w:val="000000"/>
-                <w:kern w:val="0"/>
-                <w:sz w:val="20"/>
-                <w:szCs w:val="20"/>
-                <w14:ligatures w14:val="none"/>
-              </w:rPr>
-              <w:t>_id</w:t>
-            </w:r>
-            <w:proofErr w:type="spellEnd"/>
+            <w:r>
+              <w:rPr>
+                <w:rFonts w:ascii="Aptos" w:eastAsia="Times New Roman" w:hAnsi="Aptos" w:cs="Times New Roman"/>
+                <w:color w:val="000000"/>
+                <w:kern w:val="0"/>
+                <w:sz w:val="20"/>
+                <w:szCs w:val="20"/>
+                <w14:ligatures w14:val="none"/>
+              </w:rPr>
+              <w:t>natural_keys.pubmed_id</w:t>
+            </w:r>
           </w:p>
         </w:tc>
         <w:tc>
@@ -10982,8 +9575,6 @@
                 <w14:ligatures w14:val="none"/>
               </w:rPr>
             </w:pPr>
-            <w:proofErr w:type="spellStart"/>
-            <w:proofErr w:type="gramStart"/>
             <w:r>
               <w:rPr>
                 <w:rFonts w:ascii="Aptos" w:eastAsia="Times New Roman" w:hAnsi="Aptos" w:cs="Times New Roman"/>
@@ -10995,8 +9586,6 @@
               </w:rPr>
               <w:t>metadata.year</w:t>
             </w:r>
-            <w:proofErr w:type="spellEnd"/>
-            <w:proofErr w:type="gramEnd"/>
           </w:p>
         </w:tc>
         <w:tc>
@@ -11101,7 +9690,6 @@
                 <w14:ligatures w14:val="none"/>
               </w:rPr>
             </w:pPr>
-            <w:proofErr w:type="spellStart"/>
             <w:r>
               <w:rPr>
                 <w:rFonts w:ascii="Aptos" w:eastAsia="Times New Roman" w:hAnsi="Aptos" w:cs="Times New Roman"/>
@@ -11113,7 +9701,6 @@
               </w:rPr>
               <w:t>article_title</w:t>
             </w:r>
-            <w:proofErr w:type="spellEnd"/>
           </w:p>
         </w:tc>
         <w:tc>
@@ -11139,8 +9726,6 @@
                 <w14:ligatures w14:val="none"/>
               </w:rPr>
             </w:pPr>
-            <w:proofErr w:type="spellStart"/>
-            <w:proofErr w:type="gramStart"/>
             <w:r>
               <w:rPr>
                 <w:rFonts w:ascii="Aptos" w:eastAsia="Times New Roman" w:hAnsi="Aptos" w:cs="Times New Roman"/>
@@ -11152,8 +9737,6 @@
               </w:rPr>
               <w:t>metadata.title</w:t>
             </w:r>
-            <w:proofErr w:type="spellEnd"/>
-            <w:proofErr w:type="gramEnd"/>
           </w:p>
         </w:tc>
         <w:tc>
@@ -11405,7 +9988,6 @@
                 <w14:ligatures w14:val="none"/>
               </w:rPr>
             </w:pPr>
-            <w:proofErr w:type="spellStart"/>
             <w:r>
               <w:rPr>
                 <w:rFonts w:ascii="Aptos" w:eastAsia="Times New Roman" w:hAnsi="Aptos" w:cs="Times New Roman"/>
@@ -11417,7 +9999,6 @@
               </w:rPr>
               <w:t>search_corpus</w:t>
             </w:r>
-            <w:proofErr w:type="spellEnd"/>
           </w:p>
         </w:tc>
         <w:tc>
@@ -11558,8 +10139,6 @@
                 <w14:ligatures w14:val="none"/>
               </w:rPr>
             </w:pPr>
-            <w:proofErr w:type="spellStart"/>
-            <w:proofErr w:type="gramStart"/>
             <w:r>
               <w:rPr>
                 <w:rFonts w:ascii="Aptos" w:eastAsia="Times New Roman" w:hAnsi="Aptos" w:cs="Times New Roman"/>
@@ -11571,8 +10150,6 @@
               </w:rPr>
               <w:t>metadata.journal</w:t>
             </w:r>
-            <w:proofErr w:type="spellEnd"/>
-            <w:proofErr w:type="gramEnd"/>
           </w:p>
         </w:tc>
         <w:tc>
@@ -11824,7 +10401,6 @@
                 <w14:ligatures w14:val="none"/>
               </w:rPr>
             </w:pPr>
-            <w:proofErr w:type="spellStart"/>
             <w:r>
               <w:rPr>
                 <w:rFonts w:ascii="Aptos" w:eastAsia="Times New Roman" w:hAnsi="Aptos" w:cs="Times New Roman"/>
@@ -11836,7 +10412,6 @@
               </w:rPr>
               <w:t>search_corpus</w:t>
             </w:r>
-            <w:proofErr w:type="spellEnd"/>
           </w:p>
         </w:tc>
         <w:tc>
@@ -11871,31 +10446,7 @@
                 <w:szCs w:val="20"/>
                 <w14:ligatures w14:val="none"/>
               </w:rPr>
-              <w:t>Prefix: "</w:t>
-            </w:r>
-            <w:proofErr w:type="gramStart"/>
-            <w:r>
-              <w:rPr>
-                <w:rFonts w:ascii="Aptos" w:eastAsia="Times New Roman" w:hAnsi="Aptos" w:cs="Times New Roman"/>
-                <w:color w:val="000000"/>
-                <w:kern w:val="0"/>
-                <w:sz w:val="20"/>
-                <w:szCs w:val="20"/>
-                <w14:ligatures w14:val="none"/>
-              </w:rPr>
-              <w:t>Journal: {</w:t>
-            </w:r>
-            <w:proofErr w:type="gramEnd"/>
-            <w:r>
-              <w:rPr>
-                <w:rFonts w:ascii="Aptos" w:eastAsia="Times New Roman" w:hAnsi="Aptos" w:cs="Times New Roman"/>
-                <w:color w:val="000000"/>
-                <w:kern w:val="0"/>
-                <w:sz w:val="20"/>
-                <w:szCs w:val="20"/>
-                <w14:ligatures w14:val="none"/>
-              </w:rPr>
-              <w:t>x}"</w:t>
+              <w:t>Prefix: "Journal: {x}"</w:t>
             </w:r>
           </w:p>
         </w:tc>
@@ -12002,7 +10553,6 @@
                 <w14:ligatures w14:val="none"/>
               </w:rPr>
             </w:pPr>
-            <w:proofErr w:type="spellStart"/>
             <w:r>
               <w:rPr>
                 <w:rFonts w:ascii="Aptos" w:eastAsia="Times New Roman" w:hAnsi="Aptos" w:cs="Times New Roman"/>
@@ -12014,7 +10564,6 @@
               </w:rPr>
               <w:t>search_corpus</w:t>
             </w:r>
-            <w:proofErr w:type="spellEnd"/>
           </w:p>
         </w:tc>
         <w:tc>
@@ -12327,7 +10876,6 @@
                 <w14:ligatures w14:val="none"/>
               </w:rPr>
             </w:pPr>
-            <w:proofErr w:type="spellStart"/>
             <w:r>
               <w:rPr>
                 <w:rFonts w:ascii="Aptos" w:eastAsia="Times New Roman" w:hAnsi="Aptos" w:cs="Times New Roman"/>
@@ -12342,7 +10890,6 @@
               <w:lastRenderedPageBreak/>
               <w:t>dim_drug</w:t>
             </w:r>
-            <w:proofErr w:type="spellEnd"/>
           </w:p>
         </w:tc>
         <w:tc>
@@ -12368,7 +10915,6 @@
                 <w14:ligatures w14:val="none"/>
               </w:rPr>
             </w:pPr>
-            <w:proofErr w:type="spellStart"/>
             <w:r>
               <w:rPr>
                 <w:rFonts w:ascii="Aptos" w:eastAsia="Times New Roman" w:hAnsi="Aptos" w:cs="Times New Roman"/>
@@ -12380,7 +10926,6 @@
               </w:rPr>
               <w:t>drug_chembl_id</w:t>
             </w:r>
-            <w:proofErr w:type="spellEnd"/>
           </w:p>
         </w:tc>
         <w:tc>
@@ -12406,43 +10951,17 @@
                 <w14:ligatures w14:val="none"/>
               </w:rPr>
             </w:pPr>
-            <w:proofErr w:type="spellStart"/>
-            <w:r>
-              <w:rPr>
-                <w:rFonts w:ascii="Aptos" w:eastAsia="Times New Roman" w:hAnsi="Aptos" w:cs="Times New Roman"/>
-                <w:color w:val="000000"/>
-                <w:kern w:val="0"/>
-                <w:sz w:val="20"/>
-                <w:szCs w:val="20"/>
-                <w14:ligatures w14:val="none"/>
-              </w:rPr>
-              <w:t>natural_</w:t>
-            </w:r>
-            <w:proofErr w:type="gramStart"/>
-            <w:r>
-              <w:rPr>
-                <w:rFonts w:ascii="Aptos" w:eastAsia="Times New Roman" w:hAnsi="Aptos" w:cs="Times New Roman"/>
-                <w:color w:val="000000"/>
-                <w:kern w:val="0"/>
-                <w:sz w:val="20"/>
-                <w:szCs w:val="20"/>
-                <w14:ligatures w14:val="none"/>
-              </w:rPr>
-              <w:t>keys.chembl</w:t>
-            </w:r>
-            <w:proofErr w:type="gramEnd"/>
-            <w:r>
-              <w:rPr>
-                <w:rFonts w:ascii="Aptos" w:eastAsia="Times New Roman" w:hAnsi="Aptos" w:cs="Times New Roman"/>
-                <w:color w:val="000000"/>
-                <w:kern w:val="0"/>
-                <w:sz w:val="20"/>
-                <w:szCs w:val="20"/>
-                <w14:ligatures w14:val="none"/>
-              </w:rPr>
-              <w:t>_ids</w:t>
-            </w:r>
-            <w:proofErr w:type="spellEnd"/>
+            <w:r>
+              <w:rPr>
+                <w:rFonts w:ascii="Aptos" w:eastAsia="Times New Roman" w:hAnsi="Aptos" w:cs="Times New Roman"/>
+                <w:color w:val="000000"/>
+                <w:kern w:val="0"/>
+                <w:sz w:val="20"/>
+                <w:szCs w:val="20"/>
+                <w14:ligatures w14:val="none"/>
+              </w:rPr>
+              <w:t>natural_keys.chembl_ids</w:t>
+            </w:r>
           </w:p>
         </w:tc>
         <w:tc>
@@ -12545,7 +11064,6 @@
                 <w14:ligatures w14:val="none"/>
               </w:rPr>
             </w:pPr>
-            <w:proofErr w:type="spellStart"/>
             <w:r>
               <w:rPr>
                 <w:rFonts w:ascii="Aptos" w:eastAsia="Times New Roman" w:hAnsi="Aptos" w:cs="Times New Roman"/>
@@ -12557,7 +11075,6 @@
               </w:rPr>
               <w:t>drug_name</w:t>
             </w:r>
-            <w:proofErr w:type="spellEnd"/>
           </w:p>
         </w:tc>
         <w:tc>
@@ -12583,7 +11100,6 @@
                 <w14:ligatures w14:val="none"/>
               </w:rPr>
             </w:pPr>
-            <w:proofErr w:type="spellStart"/>
             <w:r>
               <w:rPr>
                 <w:rFonts w:ascii="Aptos" w:eastAsia="Times New Roman" w:hAnsi="Aptos" w:cs="Times New Roman"/>
@@ -12595,7 +11111,6 @@
               </w:rPr>
               <w:t>search_corpus</w:t>
             </w:r>
-            <w:proofErr w:type="spellEnd"/>
           </w:p>
         </w:tc>
         <w:tc>
@@ -12630,31 +11145,7 @@
                 <w:szCs w:val="20"/>
                 <w14:ligatures w14:val="none"/>
               </w:rPr>
-              <w:t>Prefix: "</w:t>
-            </w:r>
-            <w:proofErr w:type="gramStart"/>
-            <w:r>
-              <w:rPr>
-                <w:rFonts w:ascii="Aptos" w:eastAsia="Times New Roman" w:hAnsi="Aptos" w:cs="Times New Roman"/>
-                <w:color w:val="000000"/>
-                <w:kern w:val="0"/>
-                <w:sz w:val="20"/>
-                <w:szCs w:val="20"/>
-                <w14:ligatures w14:val="none"/>
-              </w:rPr>
-              <w:t>Compound: {</w:t>
-            </w:r>
-            <w:proofErr w:type="gramEnd"/>
-            <w:r>
-              <w:rPr>
-                <w:rFonts w:ascii="Aptos" w:eastAsia="Times New Roman" w:hAnsi="Aptos" w:cs="Times New Roman"/>
-                <w:color w:val="000000"/>
-                <w:kern w:val="0"/>
-                <w:sz w:val="20"/>
-                <w:szCs w:val="20"/>
-                <w14:ligatures w14:val="none"/>
-              </w:rPr>
-              <w:t>x}"</w:t>
+              <w:t>Prefix: "Compound: {x}"</w:t>
             </w:r>
           </w:p>
         </w:tc>
@@ -12724,7 +11215,6 @@
                 <w14:ligatures w14:val="none"/>
               </w:rPr>
             </w:pPr>
-            <w:proofErr w:type="spellStart"/>
             <w:r>
               <w:rPr>
                 <w:rFonts w:ascii="Aptos" w:eastAsia="Times New Roman" w:hAnsi="Aptos" w:cs="Times New Roman"/>
@@ -12736,7 +11226,6 @@
               </w:rPr>
               <w:t>molecule_type</w:t>
             </w:r>
-            <w:proofErr w:type="spellEnd"/>
           </w:p>
         </w:tc>
         <w:tc>
@@ -12762,56 +11251,17 @@
                 <w14:ligatures w14:val="none"/>
               </w:rPr>
             </w:pPr>
-            <w:proofErr w:type="spellStart"/>
-            <w:proofErr w:type="gramStart"/>
-            <w:r>
-              <w:rPr>
-                <w:rFonts w:ascii="Aptos" w:eastAsia="Times New Roman" w:hAnsi="Aptos" w:cs="Times New Roman"/>
-                <w:color w:val="000000"/>
-                <w:kern w:val="0"/>
-                <w:sz w:val="20"/>
-                <w:szCs w:val="20"/>
-                <w14:ligatures w14:val="none"/>
-              </w:rPr>
-              <w:t>metadata.scientific</w:t>
-            </w:r>
-            <w:proofErr w:type="gramEnd"/>
-            <w:r>
-              <w:rPr>
-                <w:rFonts w:ascii="Aptos" w:eastAsia="Times New Roman" w:hAnsi="Aptos" w:cs="Times New Roman"/>
-                <w:color w:val="000000"/>
-                <w:kern w:val="0"/>
-                <w:sz w:val="20"/>
-                <w:szCs w:val="20"/>
-                <w14:ligatures w14:val="none"/>
-              </w:rPr>
-              <w:t>_</w:t>
-            </w:r>
-            <w:proofErr w:type="gramStart"/>
-            <w:r>
-              <w:rPr>
-                <w:rFonts w:ascii="Aptos" w:eastAsia="Times New Roman" w:hAnsi="Aptos" w:cs="Times New Roman"/>
-                <w:color w:val="000000"/>
-                <w:kern w:val="0"/>
-                <w:sz w:val="20"/>
-                <w:szCs w:val="20"/>
-                <w14:ligatures w14:val="none"/>
-              </w:rPr>
-              <w:t>context.molecule</w:t>
-            </w:r>
-            <w:proofErr w:type="gramEnd"/>
-            <w:r>
-              <w:rPr>
-                <w:rFonts w:ascii="Aptos" w:eastAsia="Times New Roman" w:hAnsi="Aptos" w:cs="Times New Roman"/>
-                <w:color w:val="000000"/>
-                <w:kern w:val="0"/>
-                <w:sz w:val="20"/>
-                <w:szCs w:val="20"/>
-                <w14:ligatures w14:val="none"/>
-              </w:rPr>
-              <w:t>_types</w:t>
-            </w:r>
-            <w:proofErr w:type="spellEnd"/>
+            <w:r>
+              <w:rPr>
+                <w:rFonts w:ascii="Aptos" w:eastAsia="Times New Roman" w:hAnsi="Aptos" w:cs="Times New Roman"/>
+                <w:color w:val="000000"/>
+                <w:kern w:val="0"/>
+                <w:sz w:val="20"/>
+                <w:szCs w:val="20"/>
+                <w14:ligatures w14:val="none"/>
+              </w:rPr>
+              <w:t>metadata.scientific_context.molecule_types</w:t>
+            </w:r>
           </w:p>
         </w:tc>
         <w:tc>
@@ -13063,7 +11513,6 @@
                 <w14:ligatures w14:val="none"/>
               </w:rPr>
             </w:pPr>
-            <w:proofErr w:type="spellStart"/>
             <w:r>
               <w:rPr>
                 <w:rFonts w:ascii="Aptos" w:eastAsia="Times New Roman" w:hAnsi="Aptos" w:cs="Times New Roman"/>
@@ -13075,7 +11524,6 @@
               </w:rPr>
               <w:t>search_corpus</w:t>
             </w:r>
-            <w:proofErr w:type="spellEnd"/>
           </w:p>
         </w:tc>
         <w:tc>
@@ -13110,31 +11558,7 @@
                 <w:szCs w:val="20"/>
                 <w14:ligatures w14:val="none"/>
               </w:rPr>
-              <w:t>Prefix: "</w:t>
-            </w:r>
-            <w:proofErr w:type="gramStart"/>
-            <w:r>
-              <w:rPr>
-                <w:rFonts w:ascii="Aptos" w:eastAsia="Times New Roman" w:hAnsi="Aptos" w:cs="Times New Roman"/>
-                <w:color w:val="000000"/>
-                <w:kern w:val="0"/>
-                <w:sz w:val="20"/>
-                <w:szCs w:val="20"/>
-                <w14:ligatures w14:val="none"/>
-              </w:rPr>
-              <w:t>Type: {</w:t>
-            </w:r>
-            <w:proofErr w:type="gramEnd"/>
-            <w:r>
-              <w:rPr>
-                <w:rFonts w:ascii="Aptos" w:eastAsia="Times New Roman" w:hAnsi="Aptos" w:cs="Times New Roman"/>
-                <w:color w:val="000000"/>
-                <w:kern w:val="0"/>
-                <w:sz w:val="20"/>
-                <w:szCs w:val="20"/>
-                <w14:ligatures w14:val="none"/>
-              </w:rPr>
-              <w:t>x}"</w:t>
+              <w:t>Prefix: "Type: {x}"</w:t>
             </w:r>
           </w:p>
         </w:tc>
@@ -13168,7 +11592,6 @@
                 <w14:ligatures w14:val="none"/>
               </w:rPr>
             </w:pPr>
-            <w:proofErr w:type="spellStart"/>
             <w:r>
               <w:rPr>
                 <w:rFonts w:ascii="Aptos" w:eastAsia="Times New Roman" w:hAnsi="Aptos" w:cs="Times New Roman"/>
@@ -13182,7 +11605,6 @@
               </w:rPr>
               <w:t>dim_protein</w:t>
             </w:r>
-            <w:proofErr w:type="spellEnd"/>
           </w:p>
         </w:tc>
         <w:tc>
@@ -13208,7 +11630,6 @@
                 <w14:ligatures w14:val="none"/>
               </w:rPr>
             </w:pPr>
-            <w:proofErr w:type="spellStart"/>
             <w:r>
               <w:rPr>
                 <w:rFonts w:ascii="Aptos" w:eastAsia="Times New Roman" w:hAnsi="Aptos" w:cs="Times New Roman"/>
@@ -13220,7 +11641,6 @@
               </w:rPr>
               <w:t>uniprot_id</w:t>
             </w:r>
-            <w:proofErr w:type="spellEnd"/>
           </w:p>
         </w:tc>
         <w:tc>
@@ -13246,43 +11666,17 @@
                 <w14:ligatures w14:val="none"/>
               </w:rPr>
             </w:pPr>
-            <w:proofErr w:type="spellStart"/>
-            <w:r>
-              <w:rPr>
-                <w:rFonts w:ascii="Aptos" w:eastAsia="Times New Roman" w:hAnsi="Aptos" w:cs="Times New Roman"/>
-                <w:color w:val="000000"/>
-                <w:kern w:val="0"/>
-                <w:sz w:val="20"/>
-                <w:szCs w:val="20"/>
-                <w14:ligatures w14:val="none"/>
-              </w:rPr>
-              <w:t>natural_</w:t>
-            </w:r>
-            <w:proofErr w:type="gramStart"/>
-            <w:r>
-              <w:rPr>
-                <w:rFonts w:ascii="Aptos" w:eastAsia="Times New Roman" w:hAnsi="Aptos" w:cs="Times New Roman"/>
-                <w:color w:val="000000"/>
-                <w:kern w:val="0"/>
-                <w:sz w:val="20"/>
-                <w:szCs w:val="20"/>
-                <w14:ligatures w14:val="none"/>
-              </w:rPr>
-              <w:t>keys.uniprot</w:t>
-            </w:r>
-            <w:proofErr w:type="gramEnd"/>
-            <w:r>
-              <w:rPr>
-                <w:rFonts w:ascii="Aptos" w:eastAsia="Times New Roman" w:hAnsi="Aptos" w:cs="Times New Roman"/>
-                <w:color w:val="000000"/>
-                <w:kern w:val="0"/>
-                <w:sz w:val="20"/>
-                <w:szCs w:val="20"/>
-                <w14:ligatures w14:val="none"/>
-              </w:rPr>
-              <w:t>_ids</w:t>
-            </w:r>
-            <w:proofErr w:type="spellEnd"/>
+            <w:r>
+              <w:rPr>
+                <w:rFonts w:ascii="Aptos" w:eastAsia="Times New Roman" w:hAnsi="Aptos" w:cs="Times New Roman"/>
+                <w:color w:val="000000"/>
+                <w:kern w:val="0"/>
+                <w:sz w:val="20"/>
+                <w:szCs w:val="20"/>
+                <w14:ligatures w14:val="none"/>
+              </w:rPr>
+              <w:t>natural_keys.uniprot_ids</w:t>
+            </w:r>
           </w:p>
         </w:tc>
         <w:tc>
@@ -13385,7 +11779,6 @@
                 <w14:ligatures w14:val="none"/>
               </w:rPr>
             </w:pPr>
-            <w:proofErr w:type="spellStart"/>
             <w:r>
               <w:rPr>
                 <w:rFonts w:ascii="Aptos" w:eastAsia="Times New Roman" w:hAnsi="Aptos" w:cs="Times New Roman"/>
@@ -13397,7 +11790,6 @@
               </w:rPr>
               <w:t>protein_name</w:t>
             </w:r>
-            <w:proofErr w:type="spellEnd"/>
           </w:p>
         </w:tc>
         <w:tc>
@@ -13423,7 +11815,6 @@
                 <w14:ligatures w14:val="none"/>
               </w:rPr>
             </w:pPr>
-            <w:proofErr w:type="spellStart"/>
             <w:r>
               <w:rPr>
                 <w:rFonts w:ascii="Aptos" w:eastAsia="Times New Roman" w:hAnsi="Aptos" w:cs="Times New Roman"/>
@@ -13435,7 +11826,6 @@
               </w:rPr>
               <w:t>search_corpus</w:t>
             </w:r>
-            <w:proofErr w:type="spellEnd"/>
           </w:p>
         </w:tc>
         <w:tc>
@@ -13470,31 +11860,7 @@
                 <w:szCs w:val="20"/>
                 <w14:ligatures w14:val="none"/>
               </w:rPr>
-              <w:t>Prefix: "</w:t>
-            </w:r>
-            <w:proofErr w:type="gramStart"/>
-            <w:r>
-              <w:rPr>
-                <w:rFonts w:ascii="Aptos" w:eastAsia="Times New Roman" w:hAnsi="Aptos" w:cs="Times New Roman"/>
-                <w:color w:val="000000"/>
-                <w:kern w:val="0"/>
-                <w:sz w:val="20"/>
-                <w:szCs w:val="20"/>
-                <w14:ligatures w14:val="none"/>
-              </w:rPr>
-              <w:t>Target: {</w:t>
-            </w:r>
-            <w:proofErr w:type="gramEnd"/>
-            <w:r>
-              <w:rPr>
-                <w:rFonts w:ascii="Aptos" w:eastAsia="Times New Roman" w:hAnsi="Aptos" w:cs="Times New Roman"/>
-                <w:color w:val="000000"/>
-                <w:kern w:val="0"/>
-                <w:sz w:val="20"/>
-                <w:szCs w:val="20"/>
-                <w14:ligatures w14:val="none"/>
-              </w:rPr>
-              <w:t>x}"</w:t>
+              <w:t>Prefix: "Target: {x}"</w:t>
             </w:r>
           </w:p>
         </w:tc>
@@ -13562,7 +11928,6 @@
                 <w14:ligatures w14:val="none"/>
               </w:rPr>
             </w:pPr>
-            <w:proofErr w:type="spellStart"/>
             <w:r>
               <w:rPr>
                 <w:rFonts w:ascii="Aptos" w:eastAsia="Times New Roman" w:hAnsi="Aptos" w:cs="Times New Roman"/>
@@ -13574,7 +11939,6 @@
               </w:rPr>
               <w:t>gene_names</w:t>
             </w:r>
-            <w:proofErr w:type="spellEnd"/>
           </w:p>
         </w:tc>
         <w:tc>
@@ -13600,7 +11964,6 @@
                 <w14:ligatures w14:val="none"/>
               </w:rPr>
             </w:pPr>
-            <w:proofErr w:type="spellStart"/>
             <w:r>
               <w:rPr>
                 <w:rFonts w:ascii="Aptos" w:eastAsia="Times New Roman" w:hAnsi="Aptos" w:cs="Times New Roman"/>
@@ -13612,7 +11975,6 @@
               </w:rPr>
               <w:t>search_corpus</w:t>
             </w:r>
-            <w:proofErr w:type="spellEnd"/>
           </w:p>
         </w:tc>
         <w:tc>
@@ -13647,31 +12009,7 @@
                 <w:szCs w:val="20"/>
                 <w14:ligatures w14:val="none"/>
               </w:rPr>
-              <w:t>Prefix: "</w:t>
-            </w:r>
-            <w:proofErr w:type="gramStart"/>
-            <w:r>
-              <w:rPr>
-                <w:rFonts w:ascii="Aptos" w:eastAsia="Times New Roman" w:hAnsi="Aptos" w:cs="Times New Roman"/>
-                <w:color w:val="000000"/>
-                <w:kern w:val="0"/>
-                <w:sz w:val="20"/>
-                <w:szCs w:val="20"/>
-                <w14:ligatures w14:val="none"/>
-              </w:rPr>
-              <w:t>Genes: {</w:t>
-            </w:r>
-            <w:proofErr w:type="gramEnd"/>
-            <w:r>
-              <w:rPr>
-                <w:rFonts w:ascii="Aptos" w:eastAsia="Times New Roman" w:hAnsi="Aptos" w:cs="Times New Roman"/>
-                <w:color w:val="000000"/>
-                <w:kern w:val="0"/>
-                <w:sz w:val="20"/>
-                <w:szCs w:val="20"/>
-                <w14:ligatures w14:val="none"/>
-              </w:rPr>
-              <w:t>x}"</w:t>
+              <w:t>Prefix: "Genes: {x}"</w:t>
             </w:r>
           </w:p>
         </w:tc>
@@ -13705,7 +12043,6 @@
                 <w14:ligatures w14:val="none"/>
               </w:rPr>
             </w:pPr>
-            <w:proofErr w:type="spellStart"/>
             <w:r>
               <w:rPr>
                 <w:rFonts w:ascii="Aptos" w:eastAsia="Times New Roman" w:hAnsi="Aptos" w:cs="Times New Roman"/>
@@ -13719,7 +12056,6 @@
               </w:rPr>
               <w:t>dim_structure</w:t>
             </w:r>
-            <w:proofErr w:type="spellEnd"/>
           </w:p>
         </w:tc>
         <w:tc>
@@ -13745,7 +12081,6 @@
                 <w14:ligatures w14:val="none"/>
               </w:rPr>
             </w:pPr>
-            <w:proofErr w:type="spellStart"/>
             <w:r>
               <w:rPr>
                 <w:rFonts w:ascii="Aptos" w:eastAsia="Times New Roman" w:hAnsi="Aptos" w:cs="Times New Roman"/>
@@ -13757,7 +12092,6 @@
               </w:rPr>
               <w:t>pdb_id</w:t>
             </w:r>
-            <w:proofErr w:type="spellEnd"/>
           </w:p>
         </w:tc>
         <w:tc>
@@ -13783,7 +12117,6 @@
                 <w14:ligatures w14:val="none"/>
               </w:rPr>
             </w:pPr>
-            <w:proofErr w:type="spellStart"/>
             <w:r>
               <w:rPr>
                 <w:rFonts w:ascii="Aptos" w:eastAsia="Times New Roman" w:hAnsi="Aptos" w:cs="Times New Roman"/>
@@ -13795,7 +12128,6 @@
               </w:rPr>
               <w:t>natural_keys.pdb_ids</w:t>
             </w:r>
-            <w:proofErr w:type="spellEnd"/>
           </w:p>
         </w:tc>
         <w:tc>
@@ -13936,56 +12268,17 @@
                 <w14:ligatures w14:val="none"/>
               </w:rPr>
             </w:pPr>
-            <w:proofErr w:type="spellStart"/>
-            <w:proofErr w:type="gramStart"/>
-            <w:r>
-              <w:rPr>
-                <w:rFonts w:ascii="Aptos" w:eastAsia="Times New Roman" w:hAnsi="Aptos" w:cs="Times New Roman"/>
-                <w:color w:val="000000"/>
-                <w:kern w:val="0"/>
-                <w:sz w:val="20"/>
-                <w:szCs w:val="20"/>
-                <w14:ligatures w14:val="none"/>
-              </w:rPr>
-              <w:t>metadata.scientific</w:t>
-            </w:r>
-            <w:proofErr w:type="gramEnd"/>
-            <w:r>
-              <w:rPr>
-                <w:rFonts w:ascii="Aptos" w:eastAsia="Times New Roman" w:hAnsi="Aptos" w:cs="Times New Roman"/>
-                <w:color w:val="000000"/>
-                <w:kern w:val="0"/>
-                <w:sz w:val="20"/>
-                <w:szCs w:val="20"/>
-                <w14:ligatures w14:val="none"/>
-              </w:rPr>
-              <w:t>_</w:t>
-            </w:r>
-            <w:proofErr w:type="gramStart"/>
-            <w:r>
-              <w:rPr>
-                <w:rFonts w:ascii="Aptos" w:eastAsia="Times New Roman" w:hAnsi="Aptos" w:cs="Times New Roman"/>
-                <w:color w:val="000000"/>
-                <w:kern w:val="0"/>
-                <w:sz w:val="20"/>
-                <w:szCs w:val="20"/>
-                <w14:ligatures w14:val="none"/>
-              </w:rPr>
-              <w:t>context.structure</w:t>
-            </w:r>
-            <w:proofErr w:type="gramEnd"/>
-            <w:r>
-              <w:rPr>
-                <w:rFonts w:ascii="Aptos" w:eastAsia="Times New Roman" w:hAnsi="Aptos" w:cs="Times New Roman"/>
-                <w:color w:val="000000"/>
-                <w:kern w:val="0"/>
-                <w:sz w:val="20"/>
-                <w:szCs w:val="20"/>
-                <w14:ligatures w14:val="none"/>
-              </w:rPr>
-              <w:t>_methods</w:t>
-            </w:r>
-            <w:proofErr w:type="spellEnd"/>
+            <w:r>
+              <w:rPr>
+                <w:rFonts w:ascii="Aptos" w:eastAsia="Times New Roman" w:hAnsi="Aptos" w:cs="Times New Roman"/>
+                <w:color w:val="000000"/>
+                <w:kern w:val="0"/>
+                <w:sz w:val="20"/>
+                <w:szCs w:val="20"/>
+                <w14:ligatures w14:val="none"/>
+              </w:rPr>
+              <w:t>metadata.scientific_context.structure_methods</w:t>
+            </w:r>
           </w:p>
         </w:tc>
         <w:tc>
@@ -14237,7 +12530,6 @@
                 <w14:ligatures w14:val="none"/>
               </w:rPr>
             </w:pPr>
-            <w:proofErr w:type="spellStart"/>
             <w:r>
               <w:rPr>
                 <w:rFonts w:ascii="Aptos" w:eastAsia="Times New Roman" w:hAnsi="Aptos" w:cs="Times New Roman"/>
@@ -14249,7 +12541,6 @@
               </w:rPr>
               <w:t>search_corpus</w:t>
             </w:r>
-            <w:proofErr w:type="spellEnd"/>
           </w:p>
         </w:tc>
         <w:tc>
@@ -14284,31 +12575,7 @@
                 <w:szCs w:val="20"/>
                 <w14:ligatures w14:val="none"/>
               </w:rPr>
-              <w:t xml:space="preserve">Prefix: "Structure </w:t>
-            </w:r>
-            <w:proofErr w:type="gramStart"/>
-            <w:r>
-              <w:rPr>
-                <w:rFonts w:ascii="Aptos" w:eastAsia="Times New Roman" w:hAnsi="Aptos" w:cs="Times New Roman"/>
-                <w:color w:val="000000"/>
-                <w:kern w:val="0"/>
-                <w:sz w:val="20"/>
-                <w:szCs w:val="20"/>
-                <w14:ligatures w14:val="none"/>
-              </w:rPr>
-              <w:t>method: {</w:t>
-            </w:r>
-            <w:proofErr w:type="gramEnd"/>
-            <w:r>
-              <w:rPr>
-                <w:rFonts w:ascii="Aptos" w:eastAsia="Times New Roman" w:hAnsi="Aptos" w:cs="Times New Roman"/>
-                <w:color w:val="000000"/>
-                <w:kern w:val="0"/>
-                <w:sz w:val="20"/>
-                <w:szCs w:val="20"/>
-                <w14:ligatures w14:val="none"/>
-              </w:rPr>
-              <w:t>x}"</w:t>
+              <w:t>Prefix: "Structure method: {x}"</w:t>
             </w:r>
           </w:p>
         </w:tc>
@@ -14343,7 +12610,6 @@
                 <w14:ligatures w14:val="none"/>
               </w:rPr>
             </w:pPr>
-            <w:proofErr w:type="spellStart"/>
             <w:r>
               <w:rPr>
                 <w:rFonts w:ascii="Aptos" w:eastAsia="Times New Roman" w:hAnsi="Aptos" w:cs="Times New Roman"/>
@@ -14357,7 +12623,6 @@
               </w:rPr>
               <w:t>fact_bioactivity</w:t>
             </w:r>
-            <w:proofErr w:type="spellEnd"/>
           </w:p>
         </w:tc>
         <w:tc>
@@ -14384,7 +12649,6 @@
                 <w14:ligatures w14:val="none"/>
               </w:rPr>
             </w:pPr>
-            <w:proofErr w:type="spellStart"/>
             <w:r>
               <w:rPr>
                 <w:rFonts w:ascii="Aptos" w:eastAsia="Times New Roman" w:hAnsi="Aptos" w:cs="Times New Roman"/>
@@ -14396,7 +12660,6 @@
               </w:rPr>
               <w:t>standard_type</w:t>
             </w:r>
-            <w:proofErr w:type="spellEnd"/>
           </w:p>
         </w:tc>
         <w:tc>
@@ -14422,56 +12685,17 @@
                 <w14:ligatures w14:val="none"/>
               </w:rPr>
             </w:pPr>
-            <w:proofErr w:type="spellStart"/>
-            <w:proofErr w:type="gramStart"/>
-            <w:r>
-              <w:rPr>
-                <w:rFonts w:ascii="Aptos" w:eastAsia="Times New Roman" w:hAnsi="Aptos" w:cs="Times New Roman"/>
-                <w:color w:val="000000"/>
-                <w:kern w:val="0"/>
-                <w:sz w:val="20"/>
-                <w:szCs w:val="20"/>
-                <w14:ligatures w14:val="none"/>
-              </w:rPr>
-              <w:t>metadata.scientific</w:t>
-            </w:r>
-            <w:proofErr w:type="gramEnd"/>
-            <w:r>
-              <w:rPr>
-                <w:rFonts w:ascii="Aptos" w:eastAsia="Times New Roman" w:hAnsi="Aptos" w:cs="Times New Roman"/>
-                <w:color w:val="000000"/>
-                <w:kern w:val="0"/>
-                <w:sz w:val="20"/>
-                <w:szCs w:val="20"/>
-                <w14:ligatures w14:val="none"/>
-              </w:rPr>
-              <w:t>_</w:t>
-            </w:r>
-            <w:proofErr w:type="gramStart"/>
-            <w:r>
-              <w:rPr>
-                <w:rFonts w:ascii="Aptos" w:eastAsia="Times New Roman" w:hAnsi="Aptos" w:cs="Times New Roman"/>
-                <w:color w:val="000000"/>
-                <w:kern w:val="0"/>
-                <w:sz w:val="20"/>
-                <w:szCs w:val="20"/>
-                <w14:ligatures w14:val="none"/>
-              </w:rPr>
-              <w:t>context.measurement</w:t>
-            </w:r>
-            <w:proofErr w:type="gramEnd"/>
-            <w:r>
-              <w:rPr>
-                <w:rFonts w:ascii="Aptos" w:eastAsia="Times New Roman" w:hAnsi="Aptos" w:cs="Times New Roman"/>
-                <w:color w:val="000000"/>
-                <w:kern w:val="0"/>
-                <w:sz w:val="20"/>
-                <w:szCs w:val="20"/>
-                <w14:ligatures w14:val="none"/>
-              </w:rPr>
-              <w:t>_types</w:t>
-            </w:r>
-            <w:proofErr w:type="spellEnd"/>
+            <w:r>
+              <w:rPr>
+                <w:rFonts w:ascii="Aptos" w:eastAsia="Times New Roman" w:hAnsi="Aptos" w:cs="Times New Roman"/>
+                <w:color w:val="000000"/>
+                <w:kern w:val="0"/>
+                <w:sz w:val="20"/>
+                <w:szCs w:val="20"/>
+                <w14:ligatures w14:val="none"/>
+              </w:rPr>
+              <w:t>metadata.scientific_context.measurement_types</w:t>
+            </w:r>
           </w:p>
         </w:tc>
         <w:tc>
@@ -14727,7 +12951,6 @@
                 <w14:ligatures w14:val="none"/>
               </w:rPr>
             </w:pPr>
-            <w:proofErr w:type="spellStart"/>
             <w:r>
               <w:rPr>
                 <w:rFonts w:ascii="Aptos" w:eastAsia="Times New Roman" w:hAnsi="Aptos" w:cs="Times New Roman"/>
@@ -14739,7 +12962,6 @@
               </w:rPr>
               <w:t>search_corpus</w:t>
             </w:r>
-            <w:proofErr w:type="spellEnd"/>
           </w:p>
         </w:tc>
         <w:tc>
@@ -14774,31 +12996,7 @@
                 <w:szCs w:val="20"/>
                 <w14:ligatures w14:val="none"/>
               </w:rPr>
-              <w:t>Prefix: "</w:t>
-            </w:r>
-            <w:proofErr w:type="gramStart"/>
-            <w:r>
-              <w:rPr>
-                <w:rFonts w:ascii="Aptos" w:eastAsia="Times New Roman" w:hAnsi="Aptos" w:cs="Times New Roman"/>
-                <w:color w:val="000000"/>
-                <w:kern w:val="0"/>
-                <w:sz w:val="20"/>
-                <w:szCs w:val="20"/>
-                <w14:ligatures w14:val="none"/>
-              </w:rPr>
-              <w:t>Measurement: {</w:t>
-            </w:r>
-            <w:proofErr w:type="gramEnd"/>
-            <w:r>
-              <w:rPr>
-                <w:rFonts w:ascii="Aptos" w:eastAsia="Times New Roman" w:hAnsi="Aptos" w:cs="Times New Roman"/>
-                <w:color w:val="000000"/>
-                <w:kern w:val="0"/>
-                <w:sz w:val="20"/>
-                <w:szCs w:val="20"/>
-                <w14:ligatures w14:val="none"/>
-              </w:rPr>
-              <w:t>x}"</w:t>
+              <w:t>Prefix: "Measurement: {x}"</w:t>
             </w:r>
           </w:p>
         </w:tc>
@@ -14866,7 +13064,6 @@
                 <w14:ligatures w14:val="none"/>
               </w:rPr>
             </w:pPr>
-            <w:proofErr w:type="spellStart"/>
             <w:r>
               <w:rPr>
                 <w:rFonts w:ascii="Aptos" w:eastAsia="Times New Roman" w:hAnsi="Aptos" w:cs="Times New Roman"/>
@@ -14878,7 +13075,6 @@
               </w:rPr>
               <w:t>confidence_score</w:t>
             </w:r>
-            <w:proofErr w:type="spellEnd"/>
           </w:p>
         </w:tc>
         <w:tc>
@@ -14904,7 +13100,6 @@
                 <w14:ligatures w14:val="none"/>
               </w:rPr>
             </w:pPr>
-            <w:proofErr w:type="spellStart"/>
             <w:r>
               <w:rPr>
                 <w:rFonts w:ascii="Aptos" w:eastAsia="Times New Roman" w:hAnsi="Aptos" w:cs="Times New Roman"/>
@@ -14916,7 +13111,6 @@
               </w:rPr>
               <w:t>metrics.max_confidence</w:t>
             </w:r>
-            <w:proofErr w:type="spellEnd"/>
           </w:p>
         </w:tc>
         <w:tc>
@@ -14951,31 +13145,7 @@
                 <w:szCs w:val="20"/>
                 <w14:ligatures w14:val="none"/>
               </w:rPr>
-              <w:t xml:space="preserve">Aggregate: </w:t>
-            </w:r>
-            <w:proofErr w:type="gramStart"/>
-            <w:r>
-              <w:rPr>
-                <w:rFonts w:ascii="Aptos" w:eastAsia="Times New Roman" w:hAnsi="Aptos" w:cs="Times New Roman"/>
-                <w:color w:val="000000"/>
-                <w:kern w:val="0"/>
-                <w:sz w:val="20"/>
-                <w:szCs w:val="20"/>
-                <w14:ligatures w14:val="none"/>
-              </w:rPr>
-              <w:t>MAX(</w:t>
-            </w:r>
-            <w:proofErr w:type="gramEnd"/>
-            <w:r>
-              <w:rPr>
-                <w:rFonts w:ascii="Aptos" w:eastAsia="Times New Roman" w:hAnsi="Aptos" w:cs="Times New Roman"/>
-                <w:color w:val="000000"/>
-                <w:kern w:val="0"/>
-                <w:sz w:val="20"/>
-                <w:szCs w:val="20"/>
-                <w14:ligatures w14:val="none"/>
-              </w:rPr>
-              <w:t>)</w:t>
+              <w:t>Aggregate: MAX()</w:t>
             </w:r>
           </w:p>
         </w:tc>
@@ -15043,7 +13213,6 @@
                 <w14:ligatures w14:val="none"/>
               </w:rPr>
             </w:pPr>
-            <w:proofErr w:type="spellStart"/>
             <w:r>
               <w:rPr>
                 <w:rFonts w:ascii="Aptos" w:eastAsia="Times New Roman" w:hAnsi="Aptos" w:cs="Times New Roman"/>
@@ -15055,7 +13224,6 @@
               </w:rPr>
               <w:t>pchembl_value</w:t>
             </w:r>
-            <w:proofErr w:type="spellEnd"/>
           </w:p>
         </w:tc>
         <w:tc>
@@ -15081,7 +13249,6 @@
                 <w14:ligatures w14:val="none"/>
               </w:rPr>
             </w:pPr>
-            <w:proofErr w:type="spellStart"/>
             <w:r>
               <w:rPr>
                 <w:rFonts w:ascii="Aptos" w:eastAsia="Times New Roman" w:hAnsi="Aptos" w:cs="Times New Roman"/>
@@ -15093,7 +13260,6 @@
               </w:rPr>
               <w:t>metrics.avg_pchembl</w:t>
             </w:r>
-            <w:proofErr w:type="spellEnd"/>
           </w:p>
         </w:tc>
         <w:tc>
@@ -15128,31 +13294,7 @@
                 <w:szCs w:val="20"/>
                 <w14:ligatures w14:val="none"/>
               </w:rPr>
-              <w:t xml:space="preserve">Aggregate: </w:t>
-            </w:r>
-            <w:proofErr w:type="gramStart"/>
-            <w:r>
-              <w:rPr>
-                <w:rFonts w:ascii="Aptos" w:eastAsia="Times New Roman" w:hAnsi="Aptos" w:cs="Times New Roman"/>
-                <w:color w:val="000000"/>
-                <w:kern w:val="0"/>
-                <w:sz w:val="20"/>
-                <w:szCs w:val="20"/>
-                <w14:ligatures w14:val="none"/>
-              </w:rPr>
-              <w:t>MEAN(</w:t>
-            </w:r>
-            <w:proofErr w:type="gramEnd"/>
-            <w:r>
-              <w:rPr>
-                <w:rFonts w:ascii="Aptos" w:eastAsia="Times New Roman" w:hAnsi="Aptos" w:cs="Times New Roman"/>
-                <w:color w:val="000000"/>
-                <w:kern w:val="0"/>
-                <w:sz w:val="20"/>
-                <w:szCs w:val="20"/>
-                <w14:ligatures w14:val="none"/>
-              </w:rPr>
-              <w:t>)</w:t>
+              <w:t>Aggregate: MEAN()</w:t>
             </w:r>
           </w:p>
         </w:tc>
@@ -15229,21 +13371,8 @@
                 <w:szCs w:val="20"/>
                 <w14:ligatures w14:val="none"/>
               </w:rPr>
-              <w:t>*_</w:t>
-            </w:r>
-            <w:proofErr w:type="spellStart"/>
-            <w:r>
-              <w:rPr>
-                <w:rFonts w:ascii="Aptos" w:eastAsia="Times New Roman" w:hAnsi="Aptos" w:cs="Times New Roman"/>
-                <w:color w:val="000000"/>
-                <w:kern w:val="0"/>
-                <w:sz w:val="20"/>
-                <w:szCs w:val="20"/>
-                <w14:ligatures w14:val="none"/>
-              </w:rPr>
-              <w:t>date_key</w:t>
-            </w:r>
-            <w:proofErr w:type="spellEnd"/>
+              <w:t>*_date_key</w:t>
+            </w:r>
           </w:p>
         </w:tc>
         <w:tc>
@@ -15269,43 +13398,17 @@
                 <w14:ligatures w14:val="none"/>
               </w:rPr>
             </w:pPr>
-            <w:proofErr w:type="gramStart"/>
-            <w:r>
-              <w:rPr>
-                <w:rFonts w:ascii="Aptos" w:eastAsia="Times New Roman" w:hAnsi="Aptos" w:cs="Times New Roman"/>
-                <w:color w:val="000000"/>
-                <w:kern w:val="0"/>
-                <w:sz w:val="20"/>
-                <w:szCs w:val="20"/>
-                <w14:ligatures w14:val="none"/>
-              </w:rPr>
-              <w:t>metadata.lifecycle</w:t>
-            </w:r>
-            <w:proofErr w:type="gramEnd"/>
-            <w:r>
-              <w:rPr>
-                <w:rFonts w:ascii="Aptos" w:eastAsia="Times New Roman" w:hAnsi="Aptos" w:cs="Times New Roman"/>
-                <w:color w:val="000000"/>
-                <w:kern w:val="0"/>
-                <w:sz w:val="20"/>
-                <w:szCs w:val="20"/>
-                <w14:ligatures w14:val="none"/>
-              </w:rPr>
-              <w:t>_</w:t>
-            </w:r>
-            <w:proofErr w:type="gramStart"/>
-            <w:r>
-              <w:rPr>
-                <w:rFonts w:ascii="Aptos" w:eastAsia="Times New Roman" w:hAnsi="Aptos" w:cs="Times New Roman"/>
-                <w:color w:val="000000"/>
-                <w:kern w:val="0"/>
-                <w:sz w:val="20"/>
-                <w:szCs w:val="20"/>
-                <w14:ligatures w14:val="none"/>
-              </w:rPr>
-              <w:t>dates.*</w:t>
-            </w:r>
-            <w:proofErr w:type="gramEnd"/>
+            <w:r>
+              <w:rPr>
+                <w:rFonts w:ascii="Aptos" w:eastAsia="Times New Roman" w:hAnsi="Aptos" w:cs="Times New Roman"/>
+                <w:color w:val="000000"/>
+                <w:kern w:val="0"/>
+                <w:sz w:val="20"/>
+                <w:szCs w:val="20"/>
+                <w14:ligatures w14:val="none"/>
+              </w:rPr>
+              <w:t>metadata.lifecycle_dates.*</w:t>
+            </w:r>
           </w:p>
         </w:tc>
         <w:tc>
@@ -15340,21 +13443,8 @@
                 <w:szCs w:val="20"/>
                 <w14:ligatures w14:val="none"/>
               </w:rPr>
-              <w:t xml:space="preserve">In-memory mapping with </w:t>
-            </w:r>
-            <w:proofErr w:type="spellStart"/>
-            <w:r>
-              <w:rPr>
-                <w:rFonts w:ascii="Aptos" w:eastAsia="Times New Roman" w:hAnsi="Aptos" w:cs="Times New Roman"/>
-                <w:color w:val="000000"/>
-                <w:kern w:val="0"/>
-                <w:sz w:val="20"/>
-                <w:szCs w:val="20"/>
-                <w14:ligatures w14:val="none"/>
-              </w:rPr>
-              <w:t>dim_date</w:t>
-            </w:r>
-            <w:proofErr w:type="spellEnd"/>
+              <w:t>In-memory mapping with dim_date</w:t>
+            </w:r>
           </w:p>
         </w:tc>
       </w:tr>
@@ -15384,15 +13474,7 @@
     </w:p>
     <w:p>
       <w:r>
-        <w:t xml:space="preserve">Because scientific publications report multiple bioassays, experiment-level facts are aggregated into document-level continuous variables during the Pandas </w:t>
-      </w:r>
-      <w:proofErr w:type="spellStart"/>
-      <w:r>
-        <w:t>groupby</w:t>
-      </w:r>
-      <w:proofErr w:type="spellEnd"/>
-      <w:r>
-        <w:t xml:space="preserve"> phase. These metrics are strictly isolated from the text corpus to serve as numerical features for future </w:t>
+        <w:t xml:space="preserve">Because scientific publications report multiple bioassays, experiment-level facts are aggregated into document-level continuous variables during the Pandas groupby phase. These metrics are strictly isolated from the text corpus to serve as numerical features for future </w:t>
       </w:r>
       <w:r>
         <w:t>Learning to Rank</w:t>
@@ -15408,40 +13490,15 @@
           <w:numId w:val="7"/>
         </w:numPr>
       </w:pPr>
-      <w:proofErr w:type="spellStart"/>
-      <w:r>
-        <w:rPr>
-          <w:b/>
-          <w:bCs/>
-        </w:rPr>
-        <w:t>max_confidence</w:t>
-      </w:r>
-      <w:proofErr w:type="spellEnd"/>
-      <w:r>
-        <w:rPr>
-          <w:b/>
-          <w:bCs/>
-        </w:rPr>
-        <w:t>:</w:t>
-      </w:r>
-      <w:r>
-        <w:t xml:space="preserve"> Derived from the </w:t>
-      </w:r>
-      <w:proofErr w:type="spellStart"/>
-      <w:r>
-        <w:t>ChEMBL</w:t>
-      </w:r>
-      <w:proofErr w:type="spellEnd"/>
-      <w:r>
-        <w:t xml:space="preserve"> confidence score (0-9). The pipeline extracts the maximum value across all linked assays (max(row['</w:t>
-      </w:r>
-      <w:proofErr w:type="spellStart"/>
-      <w:r>
-        <w:t>confidence_score</w:t>
-      </w:r>
-      <w:proofErr w:type="spellEnd"/>
-      <w:r>
-        <w:t>'])). A score of 9 indicates direct, highly verified single-protein target assignment.</w:t>
+      <w:r>
+        <w:rPr>
+          <w:b/>
+          <w:bCs/>
+        </w:rPr>
+        <w:t>max_confidence:</w:t>
+      </w:r>
+      <w:r>
+        <w:t xml:space="preserve"> Derived from the ChEMBL confidence score (0-9). The pipeline extracts the maximum value across all linked assays (max(row['confidence_score'])). A score of 9 indicates direct, highly verified single-protein target assignment.</w:t>
       </w:r>
     </w:p>
     <w:p>
@@ -15451,21 +13508,12 @@
           <w:numId w:val="7"/>
         </w:numPr>
       </w:pPr>
-      <w:proofErr w:type="spellStart"/>
-      <w:r>
-        <w:rPr>
-          <w:b/>
-          <w:bCs/>
-        </w:rPr>
-        <w:t>avg_pchembl</w:t>
-      </w:r>
-      <w:proofErr w:type="spellEnd"/>
-      <w:r>
-        <w:rPr>
-          <w:b/>
-          <w:bCs/>
-        </w:rPr>
-        <w:t>:</w:t>
+      <w:r>
+        <w:rPr>
+          <w:b/>
+          <w:bCs/>
+        </w:rPr>
+        <w:t>avg_pchembl:</w:t>
       </w:r>
       <w:r>
         <w:t xml:space="preserve"> The standardized negative logarithm of molar concentration (e.g., IC</w:t>
@@ -15495,33 +13543,7 @@
         <w:t>i</w:t>
       </w:r>
       <w:r>
-        <w:t xml:space="preserve">). The pipeline calculates the arithmetic </w:t>
-      </w:r>
-      <w:proofErr w:type="gramStart"/>
-      <w:r>
-        <w:t>mean</w:t>
-      </w:r>
-      <w:proofErr w:type="gramEnd"/>
-      <w:r>
-        <w:t xml:space="preserve"> of all </w:t>
-      </w:r>
-      <w:proofErr w:type="spellStart"/>
-      <w:r>
-        <w:t>pChEMBL</w:t>
-      </w:r>
-      <w:proofErr w:type="spellEnd"/>
-      <w:r>
-        <w:t xml:space="preserve"> values within the article (</w:t>
-      </w:r>
-      <w:proofErr w:type="spellStart"/>
-      <w:proofErr w:type="gramStart"/>
-      <w:r>
-        <w:t>pd.Series.mean</w:t>
-      </w:r>
-      <w:proofErr w:type="spellEnd"/>
-      <w:proofErr w:type="gramEnd"/>
-      <w:r>
-        <w:t>()), providing a continuous mathematical representation of general biological potency.</w:t>
+        <w:t>). The pipeline calculates the arithmetic mean of all pChEMBL values within the article (pd.Series.mean()), providing a continuous mathematical representation of general biological potency.</w:t>
       </w:r>
     </w:p>
     <w:p/>
@@ -15816,31 +13838,7 @@
                 <w:szCs w:val="20"/>
                 <w14:ligatures w14:val="none"/>
               </w:rPr>
-              <w:t xml:space="preserve">EGFR </w:t>
-            </w:r>
-            <w:proofErr w:type="gramStart"/>
-            <w:r>
-              <w:rPr>
-                <w:rFonts w:ascii="Aptos" w:eastAsia="Times New Roman" w:hAnsi="Aptos" w:cs="Times New Roman"/>
-                <w:color w:val="000000"/>
-                <w:kern w:val="0"/>
-                <w:sz w:val="20"/>
-                <w:szCs w:val="20"/>
-                <w14:ligatures w14:val="none"/>
-              </w:rPr>
-              <w:t>kinase</w:t>
-            </w:r>
-            <w:proofErr w:type="gramEnd"/>
-            <w:r>
-              <w:rPr>
-                <w:rFonts w:ascii="Aptos" w:eastAsia="Times New Roman" w:hAnsi="Aptos" w:cs="Times New Roman"/>
-                <w:color w:val="000000"/>
-                <w:kern w:val="0"/>
-                <w:sz w:val="20"/>
-                <w:szCs w:val="20"/>
-                <w14:ligatures w14:val="none"/>
-              </w:rPr>
-              <w:t xml:space="preserve"> inhibitors in Homo sapiens</w:t>
+              <w:t>EGFR kinase inhibitors in Homo sapiens</w:t>
             </w:r>
           </w:p>
         </w:tc>
@@ -16117,31 +14115,7 @@
                 <w:szCs w:val="20"/>
                 <w14:ligatures w14:val="none"/>
               </w:rPr>
-              <w:t xml:space="preserve">Tests </w:t>
-            </w:r>
-            <w:proofErr w:type="gramStart"/>
-            <w:r>
-              <w:rPr>
-                <w:rFonts w:ascii="Aptos" w:eastAsia="Times New Roman" w:hAnsi="Aptos" w:cs="Times New Roman"/>
-                <w:color w:val="000000"/>
-                <w:kern w:val="0"/>
-                <w:sz w:val="20"/>
-                <w:szCs w:val="20"/>
-                <w14:ligatures w14:val="none"/>
-              </w:rPr>
-              <w:t>the</w:t>
-            </w:r>
-            <w:proofErr w:type="gramEnd"/>
-            <w:r>
-              <w:rPr>
-                <w:rFonts w:ascii="Aptos" w:eastAsia="Times New Roman" w:hAnsi="Aptos" w:cs="Times New Roman"/>
-                <w:color w:val="000000"/>
-                <w:kern w:val="0"/>
-                <w:sz w:val="20"/>
-                <w:szCs w:val="20"/>
-                <w14:ligatures w14:val="none"/>
-              </w:rPr>
-              <w:t xml:space="preserve"> </w:t>
+              <w:t xml:space="preserve">Tests the </w:t>
             </w:r>
             <w:r>
               <w:rPr>
@@ -16716,31 +14690,7 @@
                 <w:szCs w:val="20"/>
                 <w14:ligatures w14:val="none"/>
               </w:rPr>
-              <w:t xml:space="preserve">EGFR </w:t>
-            </w:r>
-            <w:proofErr w:type="gramStart"/>
-            <w:r>
-              <w:rPr>
-                <w:rFonts w:ascii="Aptos" w:eastAsia="Times New Roman" w:hAnsi="Aptos" w:cs="Times New Roman"/>
-                <w:color w:val="000000"/>
-                <w:kern w:val="0"/>
-                <w:sz w:val="20"/>
-                <w:szCs w:val="20"/>
-                <w14:ligatures w14:val="none"/>
-              </w:rPr>
-              <w:t>kinase</w:t>
-            </w:r>
-            <w:proofErr w:type="gramEnd"/>
-            <w:r>
-              <w:rPr>
-                <w:rFonts w:ascii="Aptos" w:eastAsia="Times New Roman" w:hAnsi="Aptos" w:cs="Times New Roman"/>
-                <w:color w:val="000000"/>
-                <w:kern w:val="0"/>
-                <w:sz w:val="20"/>
-                <w:szCs w:val="20"/>
-                <w14:ligatures w14:val="none"/>
-              </w:rPr>
-              <w:t xml:space="preserve"> inhibitors in Homo sapiens</w:t>
+              <w:t>EGFR kinase inhibitors in Homo sapiens</w:t>
             </w:r>
           </w:p>
         </w:tc>
@@ -16812,31 +14762,7 @@
                 <w:szCs w:val="20"/>
                 <w14:ligatures w14:val="none"/>
               </w:rPr>
-              <w:t xml:space="preserve">Tests </w:t>
-            </w:r>
-            <w:proofErr w:type="gramStart"/>
-            <w:r>
-              <w:rPr>
-                <w:rFonts w:ascii="Aptos" w:eastAsia="Times New Roman" w:hAnsi="Aptos" w:cs="Times New Roman"/>
-                <w:color w:val="000000"/>
-                <w:kern w:val="0"/>
-                <w:sz w:val="20"/>
-                <w:szCs w:val="20"/>
-                <w14:ligatures w14:val="none"/>
-              </w:rPr>
-              <w:t>strict</w:t>
-            </w:r>
-            <w:proofErr w:type="gramEnd"/>
-            <w:r>
-              <w:rPr>
-                <w:rFonts w:ascii="Aptos" w:eastAsia="Times New Roman" w:hAnsi="Aptos" w:cs="Times New Roman"/>
-                <w:color w:val="000000"/>
-                <w:kern w:val="0"/>
-                <w:sz w:val="20"/>
-                <w:szCs w:val="20"/>
-                <w14:ligatures w14:val="none"/>
-              </w:rPr>
-              <w:t xml:space="preserve"> keyword precision for explicit nomenclature, protein targets, and organism constraints.</w:t>
+              <w:t>Tests strict keyword precision for explicit nomenclature, protein targets, and organism constraints.</w:t>
             </w:r>
           </w:p>
         </w:tc>
@@ -17295,31 +15221,7 @@
                 <w:szCs w:val="20"/>
                 <w14:ligatures w14:val="none"/>
               </w:rPr>
-              <w:t xml:space="preserve">Tests the model's ability to map colloquial natural language expressions </w:t>
-            </w:r>
-            <w:proofErr w:type="gramStart"/>
-            <w:r>
-              <w:rPr>
-                <w:rFonts w:ascii="Aptos" w:eastAsia="Times New Roman" w:hAnsi="Aptos" w:cs="Times New Roman"/>
-                <w:color w:val="000000"/>
-                <w:kern w:val="0"/>
-                <w:sz w:val="20"/>
-                <w:szCs w:val="20"/>
-                <w14:ligatures w14:val="none"/>
-              </w:rPr>
-              <w:t>to</w:t>
-            </w:r>
-            <w:proofErr w:type="gramEnd"/>
-            <w:r>
-              <w:rPr>
-                <w:rFonts w:ascii="Aptos" w:eastAsia="Times New Roman" w:hAnsi="Aptos" w:cs="Times New Roman"/>
-                <w:color w:val="000000"/>
-                <w:kern w:val="0"/>
-                <w:sz w:val="20"/>
-                <w:szCs w:val="20"/>
-                <w14:ligatures w14:val="none"/>
-              </w:rPr>
-              <w:t xml:space="preserve"> scientific terminology (e.g., "hypertension", adverse events).</w:t>
+              <w:t>Tests the model's ability to map colloquial natural language expressions to scientific terminology (e.g., "hypertension", adverse events).</w:t>
             </w:r>
           </w:p>
         </w:tc>
@@ -17877,7 +15779,7 @@
           <w:noProof/>
         </w:rPr>
         <w:drawing>
-          <wp:inline distT="0" distB="0" distL="0" distR="0" wp14:anchorId="06D3CC29" wp14:editId="068DB4D4">
+          <wp:inline distT="0" distB="0" distL="0" distR="0" wp14:anchorId="06D3CC29" wp14:editId="11C832C4">
             <wp:extent cx="4849792" cy="1735069"/>
             <wp:effectExtent l="0" t="0" r="0" b="0"/>
             <wp:docPr id="1568949342" name="Picture 11"/>
@@ -23140,6 +21042,7 @@
   <w:style w:type="character" w:default="1" w:styleId="DefaultParagraphFont">
     <w:name w:val="Default Paragraph Font"/>
     <w:uiPriority w:val="1"/>
+    <w:semiHidden/>
     <w:unhideWhenUsed/>
   </w:style>
   <w:style w:type="table" w:default="1" w:styleId="TableNormal">

</xml_diff>